<commit_message>
Fix chapter 4 introduction: the two hypotheses of 1-6 are tested in 4-2-3
- 4-1: the closing clause said the study has no hypothesis test; it now says the two statistical
  hypotheses (about the validity of the Delphi consensus, as in 1-6) are tested
- 4-1: the heading list names 4-2-3 as in the chapter ("بررسی آزمون فرضیه پژوهش")
- nothing else changed

Co-Authored-By: Claude <noreply@anthropic.com>
Claude-Session: https://claude.ai/code/session_012d4zYSXkv12fA3MhDxMQzc
</commit_message>
<xml_diff>
--- a/chapter4_with_charts.docx
+++ b/chapter4_with_charts.docx
@@ -72,19 +72,7 @@
         <w:rPr>
           <w:rtl/>
         </w:rPr>
-        <w:t>این فصل به گزارش یافته‌های حاصل از اجرای روش دلفی با پانل هفت نفره خبرگان اختصاص دارد. هر سه دور این فرایند — دور نخست (کیفی و اکتشافی)، و دور دوم و دور سوم (رتبه‌بندی ساختاریافته با بازخورد کنترل‌شده) — تکمیل شده‌اند. دور سوم، دور پایانی فرایند دلفی در ای</w:t>
-      </w:r>
-      <w:r>
-        <w:rPr>
-          <w:rtl/>
-        </w:rPr>
-        <w:t>ن پژوهش بود. ساختار فصل از منطق تحلیل داده در پژوهش‌های دلفی پیروی می‌کند: نخست آمار توصیفی مربوط به ترکیب پانل و خروجی دورهای دلفی ارائه می‌شود؛ سپس آمار استنباطی برای سنجش معناداری اجماع میان دورها به کار می‌رود؛ و در پایان، یافته‌ها برای پاسخ به پرسش‌ها</w:t>
-      </w:r>
-      <w:r>
-        <w:rPr>
-          <w:rtl/>
-        </w:rPr>
-        <w:t>ی پژوهش — نه آزمون فرضیه آماری، چرا که این پژوهش، همان‌گونه که در بخش ۱-۶ تشریح شد، بر پرسش پژوهش استوار است نه فرضیه از پیش تعیین‌شده — تحلیل و جمع‌بندی می‌شوند.</w:t>
+        <w:t xml:space="preserve">این فصل به گزارش یافته‌های حاصل از اجرای روش دلفی با پانل هفت نفره خبرگان اختصاص دارد. هر سه دور این فرایند — دور نخست (کیفی و اکتشافی)، و دور دوم و دور سوم (رتبه‌بندی ساختاریافته با بازخورد کنترل‌شده) — تکمیل شده‌اند. دور سوم، دور پایانی فرایند دلفی در این پژوهش بود. ساختار فصل از منطق تحلیل داده در پژوهش‌های دلفی پیروی می‌کند: نخست آمار توصیفی مربوط به ترکیب پانل و خروجی دورهای دلفی ارائه می‌شود؛ سپس آمار استنباطی برای سنجش معناداری اجماع میان دورها به کار می‌رود؛ و در پایان، دو فرضیه آماری پژوهش — که، همان‌گونه که در بخش ۱-۶ تشریح شد، نه درباره محتوای چالش‌ها بلکه درباره اعتبار فرایند اجماع‌سازی دلفی صورت‌بندی شده‌اند — آزمون می‌شوند و یافته‌ها برای پاسخ به پرسش‌های پژوهش تحلیل و جمع‌بندی می‌گردند.</w:t>
       </w:r>
     </w:p>
     <w:p>
@@ -97,13 +85,7 @@
         <w:rPr>
           <w:rtl/>
         </w:rPr>
-        <w:t>سرتیترهای این فصل به ترتیب عبارت‌اند از: تجزیه و تحلیل داده‌ها (۴-۲)، شامل تجزیه و تحلیل داده</w:t>
-      </w:r>
-      <w:r>
-        <w:rPr>
-          <w:rtl/>
-        </w:rPr>
-        <w:t>‌های آمار توصیفی (۴-۲-۱)، تجزیه و تحلیل داده‌های آمار استنباطی (۴-۲-۲) و بررسی پرسش‌های پژوهش (۴-۲-۳)؛ و در پایان، جمع‌بندی فصل (۴-۳).</w:t>
+        <w:t xml:space="preserve">سرتیترهای این فصل به ترتیب عبارت‌اند از: تجزیه و تحلیل داده‌ها (۴-۲)، شامل تجزیه و تحلیل داده‌های آمار توصیفی (۴-۲-۱)، تجزیه و تحلیل داده‌های آمار استنباطی (۴-۲-۲) و بررسی آزمون فرضیه پژوهش (۴-۲-۳)؛ و در پایان، جمع‌بندی فصل (۴-۳).</w:t>
       </w:r>
     </w:p>
     <w:p>

</xml_diff>

<commit_message>
Add the Table 2-1 counterpart to the item table
- Table 4-6 gets a column with the row of Table 2-1 that describes the
  same challenge for each item; a dash marks an item without a clear
  counterpart. Twenty items have a counterpart and nine do not; rows 3,
  6 and 11 of Table 2-1 match no item
- Chapter 4 explains the column; chapter 5 lists the nine items without
  a counterpart; chapter 3 points to the column
- The sales-staff row and the consumer-behaviour row of Table 2-1 are
  described as not raised by the panel, as before

Claude-Session: https://claude.ai/code/session_012d4zYSXkv12fA3MhDxMQzc
</commit_message>
<xml_diff>
--- a/chapter4_with_charts.docx
+++ b/chapter4_with_charts.docx
@@ -4154,7 +4154,7 @@
         <w:rPr>
           <w:rtl/>
         </w:rPr>
-        <w:t xml:space="preserve"> در شش مرحله کدگذاری و تحلیل شدند (شرح کامل این فرایند در بخش ۳-۷-۱ آمده است). کدهای استخراج‌شده با چالش‌های برگرفته از ادبیات (جدول ۲-۱) سنجیده و ترکیب شدند؛ هر گویه دست‌کم در پاسخ یک عضو پانل بازتاب داشت و گویه‌ها در قالب ۹ مؤلفه و ۲۹ گویه سامان یافتند: پنج مؤلفه درون‌سازمانی با ۱۸ گویه و چهار مؤلفه برون‌سازمانی با ۱۱ گویه. جدول ۴-۶ فهرست گویه‌ها را به تفکیک مؤلفه، به همراه کد اعضایی که به هر گویه اشاره کرده‌اند، نشان می‌دهد. این فهرست در دور دوم برای امتیازدهی در اختیار خبرگان قرار گرفت. همچنین، این فهرست با چالش‌های برگرفته از مبانی نظری (جدول ۲-۱) سنجیده شد؛ نتیجه این مقایسه در فصل پنجم بحث می‌شود.</w:t>
+        <w:t xml:space="preserve"> در شش مرحله کدگذاری و تحلیل شدند (شرح کامل این فرایند در بخش ۳-۷-۱ آمده است). کدهای استخراج‌شده با چالش‌های برگرفته از ادبیات (جدول ۲-۱) سنجیده و ترکیب شدند؛ هر گویه دست‌کم در پاسخ یک عضو پانل بازتاب داشت و گویه‌ها در قالب ۹ مؤلفه و ۲۹ گویه سامان یافتند: پنج مؤلفه درون‌سازمانی با ۱۸ گویه و چهار مؤلفه برون‌سازمانی با ۱۱ گویه. جدول ۴-۶ فهرست گویه‌ها را به تفکیک مؤلفه، به همراه کد اعضایی که به هر گویه اشاره کرده‌اند و ردیف همتای ادبی آن در جدول ۲-۱، نشان می‌دهد. این فهرست در دور دوم برای امتیازدهی در اختیار خبرگان قرار گرفت. همچنین، این فهرست با چالش‌های برگرفته از مبانی نظری (جدول ۲-۱) سنجیده شد؛ نتیجه این مقایسه در فصل پنجم بحث می‌شود. ستون «همتای ادبی» شماره ردیف چالشی از جدول ۲-۱ را نشان می‌دهد که همان چالش را توصیف می‌کند، و «—» یعنی گویه در جدول ۲-۱ همتای روشن ندارد. از ۲۹ گویه، ۲۰ گویه همتای ادبی دارند و ۹ گویه ندارند؛ از دوازده ردیف جدول ۲-۱، ردیف‌های ۳، ۶ و ۱۱ هیچ گویه‌ای را پوشش نمی‌دهند.</w:t>
       </w:r>
     </w:p>
     <w:p>
@@ -4183,7 +4183,10 @@
         </w:rPr>
       </w:pPr>
       <w:r>
-        <w:t>جدول ۴-۶ گویه‌های استخراج‌شده از دور نخست به تفکیک مؤلفه و اعضای اشاره‌کننده</w:t>
+        <w:t xml:space="preserve">جدول ۴-۶ گویه‌های استخراج‌شده از دور نخست </w:t>
+      </w:r>
+      <w:r>
+        <w:t xml:space="preserve">به تفکیک مؤلفه، اعضای اشاره‌کننده و همتای ادبی</w:t>
       </w:r>
       <w:r>
         <w:t xml:space="preserve"> (منبع: یافته‌های پژوهش)</w:t>
@@ -4208,10 +4211,11 @@
         <w:tblLook w:val="04A0" w:firstRow="1" w:lastRow="0" w:firstColumn="1" w:lastColumn="0" w:noHBand="0" w:noVBand="1"/>
       </w:tblPr>
       <w:tblGrid>
-        <w:gridCol w:w="577"/>
-        <w:gridCol w:w="2377"/>
-        <w:gridCol w:w="3559"/>
-        <w:gridCol w:w="1775"/>
+        <w:gridCol w:w="820"/>
+        <w:gridCol w:w="1800"/>
+        <w:gridCol w:w="2580"/>
+        <w:gridCol w:w="1260"/>
+        <w:gridCol w:w="1828"/>
       </w:tblGrid>
       <w:tr>
         <w:trPr>
@@ -4220,7 +4224,7 @@
         </w:trPr>
         <w:tc>
           <w:tcPr>
-            <w:tcW w:w="500" w:type="dxa"/>
+            <w:tcW w:w="820" w:type="dxa"/>
             <w:tcBorders>
               <w:top w:val="single" w:sz="4" w:space="0" w:color="000000"/>
               <w:left w:val="single" w:sz="4" w:space="0" w:color="000000"/>
@@ -4254,7 +4258,7 @@
         </w:tc>
         <w:tc>
           <w:tcPr>
-            <w:tcW w:w="2400" w:type="dxa"/>
+            <w:tcW w:w="1800" w:type="dxa"/>
             <w:tcBorders>
               <w:top w:val="single" w:sz="4" w:space="0" w:color="000000"/>
               <w:left w:val="single" w:sz="4" w:space="0" w:color="000000"/>
@@ -4288,7 +4292,7 @@
         </w:tc>
         <w:tc>
           <w:tcPr>
-            <w:tcW w:w="3600" w:type="dxa"/>
+            <w:tcW w:w="2580" w:type="dxa"/>
             <w:tcBorders>
               <w:top w:val="single" w:sz="4" w:space="0" w:color="000000"/>
               <w:left w:val="single" w:sz="4" w:space="0" w:color="000000"/>
@@ -4322,7 +4326,41 @@
         </w:tc>
         <w:tc>
           <w:tcPr>
-            <w:tcW w:w="1788" w:type="dxa"/>
+            <w:tcW w:w="1260" w:type="dxa"/>
+            <w:tcBorders>
+              <w:top w:val="single" w:sz="4" w:space="0" w:color="000000"/>
+              <w:left w:val="single" w:sz="4" w:space="0" w:color="000000"/>
+              <w:bottom w:val="single" w:sz="4" w:space="0" w:color="000000"/>
+              <w:right w:val="single" w:sz="4" w:space="0" w:color="000000"/>
+            </w:tcBorders>
+            <w:tcMar>
+              <w:top w:w="40" w:type="dxa"/>
+              <w:left w:w="80" w:type="dxa"/>
+              <w:bottom w:w="40" w:type="dxa"/>
+              <w:right w:w="80" w:type="dxa"/>
+            </w:tcMar>
+            <w:vAlign w:val="center"/>
+          </w:tcPr>
+          <w:p>
+            <w:pPr>
+              <w:bidi/>
+              <w:jc w:val="center"/>
+            </w:pPr>
+            <w:r>
+              <w:rPr>
+                <w:b/>
+                <w:bCs/>
+                <w:sz w:val="22"/>
+                <w:szCs w:val="22"/>
+                <w:rtl/>
+              </w:rPr>
+              <w:t>همتای ادبی</w:t>
+            </w:r>
+          </w:p>
+        </w:tc>
+        <w:tc>
+          <w:tcPr>
+            <w:tcW w:w="1828" w:type="dxa"/>
             <w:tcBorders>
               <w:top w:val="single" w:sz="4" w:space="0" w:color="000000"/>
               <w:left w:val="single" w:sz="4" w:space="0" w:color="000000"/>
@@ -4361,7 +4399,7 @@
         </w:trPr>
         <w:tc>
           <w:tcPr>
-            <w:tcW w:w="500" w:type="dxa"/>
+            <w:tcW w:w="820" w:type="dxa"/>
             <w:tcBorders>
               <w:top w:val="single" w:sz="4" w:space="0" w:color="000000"/>
               <w:left w:val="single" w:sz="4" w:space="0" w:color="000000"/>
@@ -4393,7 +4431,7 @@
         </w:tc>
         <w:tc>
           <w:tcPr>
-            <w:tcW w:w="2400" w:type="dxa"/>
+            <w:tcW w:w="1800" w:type="dxa"/>
             <w:tcBorders>
               <w:top w:val="single" w:sz="4" w:space="0" w:color="000000"/>
               <w:left w:val="single" w:sz="4" w:space="0" w:color="000000"/>
@@ -4425,7 +4463,7 @@
         </w:tc>
         <w:tc>
           <w:tcPr>
-            <w:tcW w:w="3600" w:type="dxa"/>
+            <w:tcW w:w="2580" w:type="dxa"/>
             <w:tcBorders>
               <w:top w:val="single" w:sz="4" w:space="0" w:color="000000"/>
               <w:left w:val="single" w:sz="4" w:space="0" w:color="000000"/>
@@ -4457,7 +4495,39 @@
         </w:tc>
         <w:tc>
           <w:tcPr>
-            <w:tcW w:w="1788" w:type="dxa"/>
+            <w:tcW w:w="1260" w:type="dxa"/>
+            <w:tcBorders>
+              <w:top w:val="single" w:sz="4" w:space="0" w:color="000000"/>
+              <w:left w:val="single" w:sz="4" w:space="0" w:color="000000"/>
+              <w:bottom w:val="single" w:sz="4" w:space="0" w:color="000000"/>
+              <w:right w:val="single" w:sz="4" w:space="0" w:color="000000"/>
+            </w:tcBorders>
+            <w:tcMar>
+              <w:top w:w="40" w:type="dxa"/>
+              <w:left w:w="80" w:type="dxa"/>
+              <w:bottom w:w="40" w:type="dxa"/>
+              <w:right w:w="80" w:type="dxa"/>
+            </w:tcMar>
+            <w:vAlign w:val="center"/>
+          </w:tcPr>
+          <w:p>
+            <w:pPr>
+              <w:bidi/>
+              <w:jc w:val="center"/>
+            </w:pPr>
+            <w:r>
+              <w:rPr>
+                <w:sz w:val="22"/>
+                <w:szCs w:val="22"/>
+                <w:rtl/>
+              </w:rPr>
+              <w:t>۱</w:t>
+            </w:r>
+          </w:p>
+        </w:tc>
+        <w:tc>
+          <w:tcPr>
+            <w:tcW w:w="1828" w:type="dxa"/>
             <w:tcBorders>
               <w:top w:val="single" w:sz="4" w:space="0" w:color="000000"/>
               <w:left w:val="single" w:sz="4" w:space="0" w:color="000000"/>
@@ -4494,7 +4564,7 @@
         </w:trPr>
         <w:tc>
           <w:tcPr>
-            <w:tcW w:w="500" w:type="dxa"/>
+            <w:tcW w:w="820" w:type="dxa"/>
             <w:tcBorders>
               <w:top w:val="single" w:sz="4" w:space="0" w:color="000000"/>
               <w:left w:val="single" w:sz="4" w:space="0" w:color="000000"/>
@@ -4526,31 +4596,31 @@
         </w:tc>
         <w:tc>
           <w:tcPr>
-            <w:tcW w:w="2400" w:type="dxa"/>
-            <w:tcBorders>
-              <w:top w:val="single" w:sz="4" w:space="0" w:color="000000"/>
-              <w:left w:val="single" w:sz="4" w:space="0" w:color="000000"/>
-              <w:bottom w:val="single" w:sz="4" w:space="0" w:color="000000"/>
-              <w:right w:val="single" w:sz="4" w:space="0" w:color="000000"/>
-            </w:tcBorders>
-            <w:tcMar>
-              <w:top w:w="40" w:type="dxa"/>
-              <w:left w:w="80" w:type="dxa"/>
-              <w:bottom w:w="40" w:type="dxa"/>
-              <w:right w:w="80" w:type="dxa"/>
-            </w:tcMar>
-            <w:vAlign w:val="center"/>
-          </w:tcPr>
-          <w:p>
-            <w:pPr>
-              <w:bidi/>
-              <w:jc w:val="center"/>
-            </w:pPr>
-          </w:p>
-        </w:tc>
-        <w:tc>
-          <w:tcPr>
-            <w:tcW w:w="3600" w:type="dxa"/>
+            <w:tcW w:w="1800" w:type="dxa"/>
+            <w:tcBorders>
+              <w:top w:val="single" w:sz="4" w:space="0" w:color="000000"/>
+              <w:left w:val="single" w:sz="4" w:space="0" w:color="000000"/>
+              <w:bottom w:val="single" w:sz="4" w:space="0" w:color="000000"/>
+              <w:right w:val="single" w:sz="4" w:space="0" w:color="000000"/>
+            </w:tcBorders>
+            <w:tcMar>
+              <w:top w:w="40" w:type="dxa"/>
+              <w:left w:w="80" w:type="dxa"/>
+              <w:bottom w:w="40" w:type="dxa"/>
+              <w:right w:w="80" w:type="dxa"/>
+            </w:tcMar>
+            <w:vAlign w:val="center"/>
+          </w:tcPr>
+          <w:p>
+            <w:pPr>
+              <w:bidi/>
+              <w:jc w:val="center"/>
+            </w:pPr>
+          </w:p>
+        </w:tc>
+        <w:tc>
+          <w:tcPr>
+            <w:tcW w:w="2580" w:type="dxa"/>
             <w:tcBorders>
               <w:top w:val="single" w:sz="4" w:space="0" w:color="000000"/>
               <w:left w:val="single" w:sz="4" w:space="0" w:color="000000"/>
@@ -4582,7 +4652,39 @@
         </w:tc>
         <w:tc>
           <w:tcPr>
-            <w:tcW w:w="1788" w:type="dxa"/>
+            <w:tcW w:w="1260" w:type="dxa"/>
+            <w:tcBorders>
+              <w:top w:val="single" w:sz="4" w:space="0" w:color="000000"/>
+              <w:left w:val="single" w:sz="4" w:space="0" w:color="000000"/>
+              <w:bottom w:val="single" w:sz="4" w:space="0" w:color="000000"/>
+              <w:right w:val="single" w:sz="4" w:space="0" w:color="000000"/>
+            </w:tcBorders>
+            <w:tcMar>
+              <w:top w:w="40" w:type="dxa"/>
+              <w:left w:w="80" w:type="dxa"/>
+              <w:bottom w:w="40" w:type="dxa"/>
+              <w:right w:w="80" w:type="dxa"/>
+            </w:tcMar>
+            <w:vAlign w:val="center"/>
+          </w:tcPr>
+          <w:p>
+            <w:pPr>
+              <w:bidi/>
+              <w:jc w:val="center"/>
+            </w:pPr>
+            <w:r>
+              <w:rPr>
+                <w:sz w:val="22"/>
+                <w:szCs w:val="22"/>
+                <w:rtl/>
+              </w:rPr>
+              <w:t>۱</w:t>
+            </w:r>
+          </w:p>
+        </w:tc>
+        <w:tc>
+          <w:tcPr>
+            <w:tcW w:w="1828" w:type="dxa"/>
             <w:tcBorders>
               <w:top w:val="single" w:sz="4" w:space="0" w:color="000000"/>
               <w:left w:val="single" w:sz="4" w:space="0" w:color="000000"/>
@@ -4619,7 +4721,7 @@
         </w:trPr>
         <w:tc>
           <w:tcPr>
-            <w:tcW w:w="500" w:type="dxa"/>
+            <w:tcW w:w="820" w:type="dxa"/>
             <w:tcBorders>
               <w:top w:val="single" w:sz="4" w:space="0" w:color="000000"/>
               <w:left w:val="single" w:sz="4" w:space="0" w:color="000000"/>
@@ -4651,31 +4753,31 @@
         </w:tc>
         <w:tc>
           <w:tcPr>
-            <w:tcW w:w="2400" w:type="dxa"/>
-            <w:tcBorders>
-              <w:top w:val="single" w:sz="4" w:space="0" w:color="000000"/>
-              <w:left w:val="single" w:sz="4" w:space="0" w:color="000000"/>
-              <w:bottom w:val="single" w:sz="4" w:space="0" w:color="000000"/>
-              <w:right w:val="single" w:sz="4" w:space="0" w:color="000000"/>
-            </w:tcBorders>
-            <w:tcMar>
-              <w:top w:w="40" w:type="dxa"/>
-              <w:left w:w="80" w:type="dxa"/>
-              <w:bottom w:w="40" w:type="dxa"/>
-              <w:right w:w="80" w:type="dxa"/>
-            </w:tcMar>
-            <w:vAlign w:val="center"/>
-          </w:tcPr>
-          <w:p>
-            <w:pPr>
-              <w:bidi/>
-              <w:jc w:val="center"/>
-            </w:pPr>
-          </w:p>
-        </w:tc>
-        <w:tc>
-          <w:tcPr>
-            <w:tcW w:w="3600" w:type="dxa"/>
+            <w:tcW w:w="1800" w:type="dxa"/>
+            <w:tcBorders>
+              <w:top w:val="single" w:sz="4" w:space="0" w:color="000000"/>
+              <w:left w:val="single" w:sz="4" w:space="0" w:color="000000"/>
+              <w:bottom w:val="single" w:sz="4" w:space="0" w:color="000000"/>
+              <w:right w:val="single" w:sz="4" w:space="0" w:color="000000"/>
+            </w:tcBorders>
+            <w:tcMar>
+              <w:top w:w="40" w:type="dxa"/>
+              <w:left w:w="80" w:type="dxa"/>
+              <w:bottom w:w="40" w:type="dxa"/>
+              <w:right w:w="80" w:type="dxa"/>
+            </w:tcMar>
+            <w:vAlign w:val="center"/>
+          </w:tcPr>
+          <w:p>
+            <w:pPr>
+              <w:bidi/>
+              <w:jc w:val="center"/>
+            </w:pPr>
+          </w:p>
+        </w:tc>
+        <w:tc>
+          <w:tcPr>
+            <w:tcW w:w="2580" w:type="dxa"/>
             <w:tcBorders>
               <w:top w:val="single" w:sz="4" w:space="0" w:color="000000"/>
               <w:left w:val="single" w:sz="4" w:space="0" w:color="000000"/>
@@ -4707,7 +4809,39 @@
         </w:tc>
         <w:tc>
           <w:tcPr>
-            <w:tcW w:w="1788" w:type="dxa"/>
+            <w:tcW w:w="1260" w:type="dxa"/>
+            <w:tcBorders>
+              <w:top w:val="single" w:sz="4" w:space="0" w:color="000000"/>
+              <w:left w:val="single" w:sz="4" w:space="0" w:color="000000"/>
+              <w:bottom w:val="single" w:sz="4" w:space="0" w:color="000000"/>
+              <w:right w:val="single" w:sz="4" w:space="0" w:color="000000"/>
+            </w:tcBorders>
+            <w:tcMar>
+              <w:top w:w="40" w:type="dxa"/>
+              <w:left w:w="80" w:type="dxa"/>
+              <w:bottom w:w="40" w:type="dxa"/>
+              <w:right w:w="80" w:type="dxa"/>
+            </w:tcMar>
+            <w:vAlign w:val="center"/>
+          </w:tcPr>
+          <w:p>
+            <w:pPr>
+              <w:bidi/>
+              <w:jc w:val="center"/>
+            </w:pPr>
+            <w:r>
+              <w:rPr>
+                <w:sz w:val="22"/>
+                <w:szCs w:val="22"/>
+                <w:rtl/>
+              </w:rPr>
+              <w:t>۱</w:t>
+            </w:r>
+          </w:p>
+        </w:tc>
+        <w:tc>
+          <w:tcPr>
+            <w:tcW w:w="1828" w:type="dxa"/>
             <w:tcBorders>
               <w:top w:val="single" w:sz="4" w:space="0" w:color="000000"/>
               <w:left w:val="single" w:sz="4" w:space="0" w:color="000000"/>
@@ -4744,7 +4878,7 @@
         </w:trPr>
         <w:tc>
           <w:tcPr>
-            <w:tcW w:w="500" w:type="dxa"/>
+            <w:tcW w:w="820" w:type="dxa"/>
             <w:tcBorders>
               <w:top w:val="single" w:sz="4" w:space="0" w:color="000000"/>
               <w:left w:val="single" w:sz="4" w:space="0" w:color="000000"/>
@@ -4776,7 +4910,7 @@
         </w:tc>
         <w:tc>
           <w:tcPr>
-            <w:tcW w:w="2400" w:type="dxa"/>
+            <w:tcW w:w="1800" w:type="dxa"/>
             <w:tcBorders>
               <w:top w:val="single" w:sz="4" w:space="0" w:color="000000"/>
               <w:left w:val="single" w:sz="4" w:space="0" w:color="000000"/>
@@ -4808,7 +4942,7 @@
         </w:tc>
         <w:tc>
           <w:tcPr>
-            <w:tcW w:w="3600" w:type="dxa"/>
+            <w:tcW w:w="2580" w:type="dxa"/>
             <w:tcBorders>
               <w:top w:val="single" w:sz="4" w:space="0" w:color="000000"/>
               <w:left w:val="single" w:sz="4" w:space="0" w:color="000000"/>
@@ -4840,7 +4974,39 @@
         </w:tc>
         <w:tc>
           <w:tcPr>
-            <w:tcW w:w="1788" w:type="dxa"/>
+            <w:tcW w:w="1260" w:type="dxa"/>
+            <w:tcBorders>
+              <w:top w:val="single" w:sz="4" w:space="0" w:color="000000"/>
+              <w:left w:val="single" w:sz="4" w:space="0" w:color="000000"/>
+              <w:bottom w:val="single" w:sz="4" w:space="0" w:color="000000"/>
+              <w:right w:val="single" w:sz="4" w:space="0" w:color="000000"/>
+            </w:tcBorders>
+            <w:tcMar>
+              <w:top w:w="40" w:type="dxa"/>
+              <w:left w:w="80" w:type="dxa"/>
+              <w:bottom w:w="40" w:type="dxa"/>
+              <w:right w:w="80" w:type="dxa"/>
+            </w:tcMar>
+            <w:vAlign w:val="center"/>
+          </w:tcPr>
+          <w:p>
+            <w:pPr>
+              <w:bidi/>
+              <w:jc w:val="center"/>
+            </w:pPr>
+            <w:r>
+              <w:rPr>
+                <w:sz w:val="22"/>
+                <w:szCs w:val="22"/>
+                <w:rtl/>
+              </w:rPr>
+              <w:t>۱۰</w:t>
+            </w:r>
+          </w:p>
+        </w:tc>
+        <w:tc>
+          <w:tcPr>
+            <w:tcW w:w="1828" w:type="dxa"/>
             <w:tcBorders>
               <w:top w:val="single" w:sz="4" w:space="0" w:color="000000"/>
               <w:left w:val="single" w:sz="4" w:space="0" w:color="000000"/>
@@ -4877,7 +5043,7 @@
         </w:trPr>
         <w:tc>
           <w:tcPr>
-            <w:tcW w:w="500" w:type="dxa"/>
+            <w:tcW w:w="820" w:type="dxa"/>
             <w:tcBorders>
               <w:top w:val="single" w:sz="4" w:space="0" w:color="000000"/>
               <w:left w:val="single" w:sz="4" w:space="0" w:color="000000"/>
@@ -4909,31 +5075,31 @@
         </w:tc>
         <w:tc>
           <w:tcPr>
-            <w:tcW w:w="2400" w:type="dxa"/>
-            <w:tcBorders>
-              <w:top w:val="single" w:sz="4" w:space="0" w:color="000000"/>
-              <w:left w:val="single" w:sz="4" w:space="0" w:color="000000"/>
-              <w:bottom w:val="single" w:sz="4" w:space="0" w:color="000000"/>
-              <w:right w:val="single" w:sz="4" w:space="0" w:color="000000"/>
-            </w:tcBorders>
-            <w:tcMar>
-              <w:top w:w="40" w:type="dxa"/>
-              <w:left w:w="80" w:type="dxa"/>
-              <w:bottom w:w="40" w:type="dxa"/>
-              <w:right w:w="80" w:type="dxa"/>
-            </w:tcMar>
-            <w:vAlign w:val="center"/>
-          </w:tcPr>
-          <w:p>
-            <w:pPr>
-              <w:bidi/>
-              <w:jc w:val="center"/>
-            </w:pPr>
-          </w:p>
-        </w:tc>
-        <w:tc>
-          <w:tcPr>
-            <w:tcW w:w="3600" w:type="dxa"/>
+            <w:tcW w:w="1800" w:type="dxa"/>
+            <w:tcBorders>
+              <w:top w:val="single" w:sz="4" w:space="0" w:color="000000"/>
+              <w:left w:val="single" w:sz="4" w:space="0" w:color="000000"/>
+              <w:bottom w:val="single" w:sz="4" w:space="0" w:color="000000"/>
+              <w:right w:val="single" w:sz="4" w:space="0" w:color="000000"/>
+            </w:tcBorders>
+            <w:tcMar>
+              <w:top w:w="40" w:type="dxa"/>
+              <w:left w:w="80" w:type="dxa"/>
+              <w:bottom w:w="40" w:type="dxa"/>
+              <w:right w:w="80" w:type="dxa"/>
+            </w:tcMar>
+            <w:vAlign w:val="center"/>
+          </w:tcPr>
+          <w:p>
+            <w:pPr>
+              <w:bidi/>
+              <w:jc w:val="center"/>
+            </w:pPr>
+          </w:p>
+        </w:tc>
+        <w:tc>
+          <w:tcPr>
+            <w:tcW w:w="2580" w:type="dxa"/>
             <w:tcBorders>
               <w:top w:val="single" w:sz="4" w:space="0" w:color="000000"/>
               <w:left w:val="single" w:sz="4" w:space="0" w:color="000000"/>
@@ -4965,7 +5131,39 @@
         </w:tc>
         <w:tc>
           <w:tcPr>
-            <w:tcW w:w="1788" w:type="dxa"/>
+            <w:tcW w:w="1260" w:type="dxa"/>
+            <w:tcBorders>
+              <w:top w:val="single" w:sz="4" w:space="0" w:color="000000"/>
+              <w:left w:val="single" w:sz="4" w:space="0" w:color="000000"/>
+              <w:bottom w:val="single" w:sz="4" w:space="0" w:color="000000"/>
+              <w:right w:val="single" w:sz="4" w:space="0" w:color="000000"/>
+            </w:tcBorders>
+            <w:tcMar>
+              <w:top w:w="40" w:type="dxa"/>
+              <w:left w:w="80" w:type="dxa"/>
+              <w:bottom w:w="40" w:type="dxa"/>
+              <w:right w:w="80" w:type="dxa"/>
+            </w:tcMar>
+            <w:vAlign w:val="center"/>
+          </w:tcPr>
+          <w:p>
+            <w:pPr>
+              <w:bidi/>
+              <w:jc w:val="center"/>
+            </w:pPr>
+            <w:r>
+              <w:rPr>
+                <w:sz w:val="22"/>
+                <w:szCs w:val="22"/>
+                <w:rtl/>
+              </w:rPr>
+              <w:t>۸، ۱۰</w:t>
+            </w:r>
+          </w:p>
+        </w:tc>
+        <w:tc>
+          <w:tcPr>
+            <w:tcW w:w="1828" w:type="dxa"/>
             <w:tcBorders>
               <w:top w:val="single" w:sz="4" w:space="0" w:color="000000"/>
               <w:left w:val="single" w:sz="4" w:space="0" w:color="000000"/>
@@ -5002,7 +5200,7 @@
         </w:trPr>
         <w:tc>
           <w:tcPr>
-            <w:tcW w:w="500" w:type="dxa"/>
+            <w:tcW w:w="820" w:type="dxa"/>
             <w:tcBorders>
               <w:top w:val="single" w:sz="4" w:space="0" w:color="000000"/>
               <w:left w:val="single" w:sz="4" w:space="0" w:color="000000"/>
@@ -5034,31 +5232,31 @@
         </w:tc>
         <w:tc>
           <w:tcPr>
-            <w:tcW w:w="2400" w:type="dxa"/>
-            <w:tcBorders>
-              <w:top w:val="single" w:sz="4" w:space="0" w:color="000000"/>
-              <w:left w:val="single" w:sz="4" w:space="0" w:color="000000"/>
-              <w:bottom w:val="single" w:sz="4" w:space="0" w:color="000000"/>
-              <w:right w:val="single" w:sz="4" w:space="0" w:color="000000"/>
-            </w:tcBorders>
-            <w:tcMar>
-              <w:top w:w="40" w:type="dxa"/>
-              <w:left w:w="80" w:type="dxa"/>
-              <w:bottom w:w="40" w:type="dxa"/>
-              <w:right w:w="80" w:type="dxa"/>
-            </w:tcMar>
-            <w:vAlign w:val="center"/>
-          </w:tcPr>
-          <w:p>
-            <w:pPr>
-              <w:bidi/>
-              <w:jc w:val="center"/>
-            </w:pPr>
-          </w:p>
-        </w:tc>
-        <w:tc>
-          <w:tcPr>
-            <w:tcW w:w="3600" w:type="dxa"/>
+            <w:tcW w:w="1800" w:type="dxa"/>
+            <w:tcBorders>
+              <w:top w:val="single" w:sz="4" w:space="0" w:color="000000"/>
+              <w:left w:val="single" w:sz="4" w:space="0" w:color="000000"/>
+              <w:bottom w:val="single" w:sz="4" w:space="0" w:color="000000"/>
+              <w:right w:val="single" w:sz="4" w:space="0" w:color="000000"/>
+            </w:tcBorders>
+            <w:tcMar>
+              <w:top w:w="40" w:type="dxa"/>
+              <w:left w:w="80" w:type="dxa"/>
+              <w:bottom w:w="40" w:type="dxa"/>
+              <w:right w:w="80" w:type="dxa"/>
+            </w:tcMar>
+            <w:vAlign w:val="center"/>
+          </w:tcPr>
+          <w:p>
+            <w:pPr>
+              <w:bidi/>
+              <w:jc w:val="center"/>
+            </w:pPr>
+          </w:p>
+        </w:tc>
+        <w:tc>
+          <w:tcPr>
+            <w:tcW w:w="2580" w:type="dxa"/>
             <w:tcBorders>
               <w:top w:val="single" w:sz="4" w:space="0" w:color="000000"/>
               <w:left w:val="single" w:sz="4" w:space="0" w:color="000000"/>
@@ -5090,7 +5288,39 @@
         </w:tc>
         <w:tc>
           <w:tcPr>
-            <w:tcW w:w="1788" w:type="dxa"/>
+            <w:tcW w:w="1260" w:type="dxa"/>
+            <w:tcBorders>
+              <w:top w:val="single" w:sz="4" w:space="0" w:color="000000"/>
+              <w:left w:val="single" w:sz="4" w:space="0" w:color="000000"/>
+              <w:bottom w:val="single" w:sz="4" w:space="0" w:color="000000"/>
+              <w:right w:val="single" w:sz="4" w:space="0" w:color="000000"/>
+            </w:tcBorders>
+            <w:tcMar>
+              <w:top w:w="40" w:type="dxa"/>
+              <w:left w:w="80" w:type="dxa"/>
+              <w:bottom w:w="40" w:type="dxa"/>
+              <w:right w:w="80" w:type="dxa"/>
+            </w:tcMar>
+            <w:vAlign w:val="center"/>
+          </w:tcPr>
+          <w:p>
+            <w:pPr>
+              <w:bidi/>
+              <w:jc w:val="center"/>
+            </w:pPr>
+            <w:r>
+              <w:rPr>
+                <w:sz w:val="22"/>
+                <w:szCs w:val="22"/>
+                <w:rtl/>
+              </w:rPr>
+              <w:t>۱۲</w:t>
+            </w:r>
+          </w:p>
+        </w:tc>
+        <w:tc>
+          <w:tcPr>
+            <w:tcW w:w="1828" w:type="dxa"/>
             <w:tcBorders>
               <w:top w:val="single" w:sz="4" w:space="0" w:color="000000"/>
               <w:left w:val="single" w:sz="4" w:space="0" w:color="000000"/>
@@ -5127,7 +5357,7 @@
         </w:trPr>
         <w:tc>
           <w:tcPr>
-            <w:tcW w:w="500" w:type="dxa"/>
+            <w:tcW w:w="820" w:type="dxa"/>
             <w:tcBorders>
               <w:top w:val="single" w:sz="4" w:space="0" w:color="000000"/>
               <w:left w:val="single" w:sz="4" w:space="0" w:color="000000"/>
@@ -5159,31 +5389,31 @@
         </w:tc>
         <w:tc>
           <w:tcPr>
-            <w:tcW w:w="2400" w:type="dxa"/>
-            <w:tcBorders>
-              <w:top w:val="single" w:sz="4" w:space="0" w:color="000000"/>
-              <w:left w:val="single" w:sz="4" w:space="0" w:color="000000"/>
-              <w:bottom w:val="single" w:sz="4" w:space="0" w:color="000000"/>
-              <w:right w:val="single" w:sz="4" w:space="0" w:color="000000"/>
-            </w:tcBorders>
-            <w:tcMar>
-              <w:top w:w="40" w:type="dxa"/>
-              <w:left w:w="80" w:type="dxa"/>
-              <w:bottom w:w="40" w:type="dxa"/>
-              <w:right w:w="80" w:type="dxa"/>
-            </w:tcMar>
-            <w:vAlign w:val="center"/>
-          </w:tcPr>
-          <w:p>
-            <w:pPr>
-              <w:bidi/>
-              <w:jc w:val="center"/>
-            </w:pPr>
-          </w:p>
-        </w:tc>
-        <w:tc>
-          <w:tcPr>
-            <w:tcW w:w="3600" w:type="dxa"/>
+            <w:tcW w:w="1800" w:type="dxa"/>
+            <w:tcBorders>
+              <w:top w:val="single" w:sz="4" w:space="0" w:color="000000"/>
+              <w:left w:val="single" w:sz="4" w:space="0" w:color="000000"/>
+              <w:bottom w:val="single" w:sz="4" w:space="0" w:color="000000"/>
+              <w:right w:val="single" w:sz="4" w:space="0" w:color="000000"/>
+            </w:tcBorders>
+            <w:tcMar>
+              <w:top w:w="40" w:type="dxa"/>
+              <w:left w:w="80" w:type="dxa"/>
+              <w:bottom w:w="40" w:type="dxa"/>
+              <w:right w:w="80" w:type="dxa"/>
+            </w:tcMar>
+            <w:vAlign w:val="center"/>
+          </w:tcPr>
+          <w:p>
+            <w:pPr>
+              <w:bidi/>
+              <w:jc w:val="center"/>
+            </w:pPr>
+          </w:p>
+        </w:tc>
+        <w:tc>
+          <w:tcPr>
+            <w:tcW w:w="2580" w:type="dxa"/>
             <w:tcBorders>
               <w:top w:val="single" w:sz="4" w:space="0" w:color="000000"/>
               <w:left w:val="single" w:sz="4" w:space="0" w:color="000000"/>
@@ -5215,7 +5445,39 @@
         </w:tc>
         <w:tc>
           <w:tcPr>
-            <w:tcW w:w="1788" w:type="dxa"/>
+            <w:tcW w:w="1260" w:type="dxa"/>
+            <w:tcBorders>
+              <w:top w:val="single" w:sz="4" w:space="0" w:color="000000"/>
+              <w:left w:val="single" w:sz="4" w:space="0" w:color="000000"/>
+              <w:bottom w:val="single" w:sz="4" w:space="0" w:color="000000"/>
+              <w:right w:val="single" w:sz="4" w:space="0" w:color="000000"/>
+            </w:tcBorders>
+            <w:tcMar>
+              <w:top w:w="40" w:type="dxa"/>
+              <w:left w:w="80" w:type="dxa"/>
+              <w:bottom w:w="40" w:type="dxa"/>
+              <w:right w:w="80" w:type="dxa"/>
+            </w:tcMar>
+            <w:vAlign w:val="center"/>
+          </w:tcPr>
+          <w:p>
+            <w:pPr>
+              <w:bidi/>
+              <w:jc w:val="center"/>
+            </w:pPr>
+            <w:r>
+              <w:rPr>
+                <w:sz w:val="22"/>
+                <w:szCs w:val="22"/>
+                <w:rtl/>
+              </w:rPr>
+              <w:t>—</w:t>
+            </w:r>
+          </w:p>
+        </w:tc>
+        <w:tc>
+          <w:tcPr>
+            <w:tcW w:w="1828" w:type="dxa"/>
             <w:tcBorders>
               <w:top w:val="single" w:sz="4" w:space="0" w:color="000000"/>
               <w:left w:val="single" w:sz="4" w:space="0" w:color="000000"/>
@@ -5252,7 +5514,7 @@
         </w:trPr>
         <w:tc>
           <w:tcPr>
-            <w:tcW w:w="500" w:type="dxa"/>
+            <w:tcW w:w="820" w:type="dxa"/>
             <w:tcBorders>
               <w:top w:val="single" w:sz="4" w:space="0" w:color="000000"/>
               <w:left w:val="single" w:sz="4" w:space="0" w:color="000000"/>
@@ -5284,7 +5546,7 @@
         </w:tc>
         <w:tc>
           <w:tcPr>
-            <w:tcW w:w="2400" w:type="dxa"/>
+            <w:tcW w:w="1800" w:type="dxa"/>
             <w:tcBorders>
               <w:top w:val="single" w:sz="4" w:space="0" w:color="000000"/>
               <w:left w:val="single" w:sz="4" w:space="0" w:color="000000"/>
@@ -5316,7 +5578,7 @@
         </w:tc>
         <w:tc>
           <w:tcPr>
-            <w:tcW w:w="3600" w:type="dxa"/>
+            <w:tcW w:w="2580" w:type="dxa"/>
             <w:tcBorders>
               <w:top w:val="single" w:sz="4" w:space="0" w:color="000000"/>
               <w:left w:val="single" w:sz="4" w:space="0" w:color="000000"/>
@@ -5348,7 +5610,39 @@
         </w:tc>
         <w:tc>
           <w:tcPr>
-            <w:tcW w:w="1788" w:type="dxa"/>
+            <w:tcW w:w="1260" w:type="dxa"/>
+            <w:tcBorders>
+              <w:top w:val="single" w:sz="4" w:space="0" w:color="000000"/>
+              <w:left w:val="single" w:sz="4" w:space="0" w:color="000000"/>
+              <w:bottom w:val="single" w:sz="4" w:space="0" w:color="000000"/>
+              <w:right w:val="single" w:sz="4" w:space="0" w:color="000000"/>
+            </w:tcBorders>
+            <w:tcMar>
+              <w:top w:w="40" w:type="dxa"/>
+              <w:left w:w="80" w:type="dxa"/>
+              <w:bottom w:w="40" w:type="dxa"/>
+              <w:right w:w="80" w:type="dxa"/>
+            </w:tcMar>
+            <w:vAlign w:val="center"/>
+          </w:tcPr>
+          <w:p>
+            <w:pPr>
+              <w:bidi/>
+              <w:jc w:val="center"/>
+            </w:pPr>
+            <w:r>
+              <w:rPr>
+                <w:sz w:val="22"/>
+                <w:szCs w:val="22"/>
+                <w:rtl/>
+              </w:rPr>
+              <w:t>—</w:t>
+            </w:r>
+          </w:p>
+        </w:tc>
+        <w:tc>
+          <w:tcPr>
+            <w:tcW w:w="1828" w:type="dxa"/>
             <w:tcBorders>
               <w:top w:val="single" w:sz="4" w:space="0" w:color="000000"/>
               <w:left w:val="single" w:sz="4" w:space="0" w:color="000000"/>
@@ -5385,7 +5679,7 @@
         </w:trPr>
         <w:tc>
           <w:tcPr>
-            <w:tcW w:w="500" w:type="dxa"/>
+            <w:tcW w:w="820" w:type="dxa"/>
             <w:tcBorders>
               <w:top w:val="single" w:sz="4" w:space="0" w:color="000000"/>
               <w:left w:val="single" w:sz="4" w:space="0" w:color="000000"/>
@@ -5417,31 +5711,31 @@
         </w:tc>
         <w:tc>
           <w:tcPr>
-            <w:tcW w:w="2400" w:type="dxa"/>
-            <w:tcBorders>
-              <w:top w:val="single" w:sz="4" w:space="0" w:color="000000"/>
-              <w:left w:val="single" w:sz="4" w:space="0" w:color="000000"/>
-              <w:bottom w:val="single" w:sz="4" w:space="0" w:color="000000"/>
-              <w:right w:val="single" w:sz="4" w:space="0" w:color="000000"/>
-            </w:tcBorders>
-            <w:tcMar>
-              <w:top w:w="40" w:type="dxa"/>
-              <w:left w:w="80" w:type="dxa"/>
-              <w:bottom w:w="40" w:type="dxa"/>
-              <w:right w:w="80" w:type="dxa"/>
-            </w:tcMar>
-            <w:vAlign w:val="center"/>
-          </w:tcPr>
-          <w:p>
-            <w:pPr>
-              <w:bidi/>
-              <w:jc w:val="center"/>
-            </w:pPr>
-          </w:p>
-        </w:tc>
-        <w:tc>
-          <w:tcPr>
-            <w:tcW w:w="3600" w:type="dxa"/>
+            <w:tcW w:w="1800" w:type="dxa"/>
+            <w:tcBorders>
+              <w:top w:val="single" w:sz="4" w:space="0" w:color="000000"/>
+              <w:left w:val="single" w:sz="4" w:space="0" w:color="000000"/>
+              <w:bottom w:val="single" w:sz="4" w:space="0" w:color="000000"/>
+              <w:right w:val="single" w:sz="4" w:space="0" w:color="000000"/>
+            </w:tcBorders>
+            <w:tcMar>
+              <w:top w:w="40" w:type="dxa"/>
+              <w:left w:w="80" w:type="dxa"/>
+              <w:bottom w:w="40" w:type="dxa"/>
+              <w:right w:w="80" w:type="dxa"/>
+            </w:tcMar>
+            <w:vAlign w:val="center"/>
+          </w:tcPr>
+          <w:p>
+            <w:pPr>
+              <w:bidi/>
+              <w:jc w:val="center"/>
+            </w:pPr>
+          </w:p>
+        </w:tc>
+        <w:tc>
+          <w:tcPr>
+            <w:tcW w:w="2580" w:type="dxa"/>
             <w:tcBorders>
               <w:top w:val="single" w:sz="4" w:space="0" w:color="000000"/>
               <w:left w:val="single" w:sz="4" w:space="0" w:color="000000"/>
@@ -5481,7 +5775,39 @@
         </w:tc>
         <w:tc>
           <w:tcPr>
-            <w:tcW w:w="1788" w:type="dxa"/>
+            <w:tcW w:w="1260" w:type="dxa"/>
+            <w:tcBorders>
+              <w:top w:val="single" w:sz="4" w:space="0" w:color="000000"/>
+              <w:left w:val="single" w:sz="4" w:space="0" w:color="000000"/>
+              <w:bottom w:val="single" w:sz="4" w:space="0" w:color="000000"/>
+              <w:right w:val="single" w:sz="4" w:space="0" w:color="000000"/>
+            </w:tcBorders>
+            <w:tcMar>
+              <w:top w:w="40" w:type="dxa"/>
+              <w:left w:w="80" w:type="dxa"/>
+              <w:bottom w:w="40" w:type="dxa"/>
+              <w:right w:w="80" w:type="dxa"/>
+            </w:tcMar>
+            <w:vAlign w:val="center"/>
+          </w:tcPr>
+          <w:p>
+            <w:pPr>
+              <w:bidi/>
+              <w:jc w:val="center"/>
+            </w:pPr>
+            <w:r>
+              <w:rPr>
+                <w:sz w:val="22"/>
+                <w:szCs w:val="22"/>
+                <w:rtl/>
+              </w:rPr>
+              <w:t>—</w:t>
+            </w:r>
+          </w:p>
+        </w:tc>
+        <w:tc>
+          <w:tcPr>
+            <w:tcW w:w="1828" w:type="dxa"/>
             <w:tcBorders>
               <w:top w:val="single" w:sz="4" w:space="0" w:color="000000"/>
               <w:left w:val="single" w:sz="4" w:space="0" w:color="000000"/>
@@ -5518,7 +5844,7 @@
         </w:trPr>
         <w:tc>
           <w:tcPr>
-            <w:tcW w:w="500" w:type="dxa"/>
+            <w:tcW w:w="820" w:type="dxa"/>
             <w:tcBorders>
               <w:top w:val="single" w:sz="4" w:space="0" w:color="000000"/>
               <w:left w:val="single" w:sz="4" w:space="0" w:color="000000"/>
@@ -5550,31 +5876,31 @@
         </w:tc>
         <w:tc>
           <w:tcPr>
-            <w:tcW w:w="2400" w:type="dxa"/>
-            <w:tcBorders>
-              <w:top w:val="single" w:sz="4" w:space="0" w:color="000000"/>
-              <w:left w:val="single" w:sz="4" w:space="0" w:color="000000"/>
-              <w:bottom w:val="single" w:sz="4" w:space="0" w:color="000000"/>
-              <w:right w:val="single" w:sz="4" w:space="0" w:color="000000"/>
-            </w:tcBorders>
-            <w:tcMar>
-              <w:top w:w="40" w:type="dxa"/>
-              <w:left w:w="80" w:type="dxa"/>
-              <w:bottom w:w="40" w:type="dxa"/>
-              <w:right w:w="80" w:type="dxa"/>
-            </w:tcMar>
-            <w:vAlign w:val="center"/>
-          </w:tcPr>
-          <w:p>
-            <w:pPr>
-              <w:bidi/>
-              <w:jc w:val="center"/>
-            </w:pPr>
-          </w:p>
-        </w:tc>
-        <w:tc>
-          <w:tcPr>
-            <w:tcW w:w="3600" w:type="dxa"/>
+            <w:tcW w:w="1800" w:type="dxa"/>
+            <w:tcBorders>
+              <w:top w:val="single" w:sz="4" w:space="0" w:color="000000"/>
+              <w:left w:val="single" w:sz="4" w:space="0" w:color="000000"/>
+              <w:bottom w:val="single" w:sz="4" w:space="0" w:color="000000"/>
+              <w:right w:val="single" w:sz="4" w:space="0" w:color="000000"/>
+            </w:tcBorders>
+            <w:tcMar>
+              <w:top w:w="40" w:type="dxa"/>
+              <w:left w:w="80" w:type="dxa"/>
+              <w:bottom w:w="40" w:type="dxa"/>
+              <w:right w:w="80" w:type="dxa"/>
+            </w:tcMar>
+            <w:vAlign w:val="center"/>
+          </w:tcPr>
+          <w:p>
+            <w:pPr>
+              <w:bidi/>
+              <w:jc w:val="center"/>
+            </w:pPr>
+          </w:p>
+        </w:tc>
+        <w:tc>
+          <w:tcPr>
+            <w:tcW w:w="2580" w:type="dxa"/>
             <w:tcBorders>
               <w:top w:val="single" w:sz="4" w:space="0" w:color="000000"/>
               <w:left w:val="single" w:sz="4" w:space="0" w:color="000000"/>
@@ -5606,7 +5932,39 @@
         </w:tc>
         <w:tc>
           <w:tcPr>
-            <w:tcW w:w="1788" w:type="dxa"/>
+            <w:tcW w:w="1260" w:type="dxa"/>
+            <w:tcBorders>
+              <w:top w:val="single" w:sz="4" w:space="0" w:color="000000"/>
+              <w:left w:val="single" w:sz="4" w:space="0" w:color="000000"/>
+              <w:bottom w:val="single" w:sz="4" w:space="0" w:color="000000"/>
+              <w:right w:val="single" w:sz="4" w:space="0" w:color="000000"/>
+            </w:tcBorders>
+            <w:tcMar>
+              <w:top w:w="40" w:type="dxa"/>
+              <w:left w:w="80" w:type="dxa"/>
+              <w:bottom w:w="40" w:type="dxa"/>
+              <w:right w:w="80" w:type="dxa"/>
+            </w:tcMar>
+            <w:vAlign w:val="center"/>
+          </w:tcPr>
+          <w:p>
+            <w:pPr>
+              <w:bidi/>
+              <w:jc w:val="center"/>
+            </w:pPr>
+            <w:r>
+              <w:rPr>
+                <w:sz w:val="22"/>
+                <w:szCs w:val="22"/>
+                <w:rtl/>
+              </w:rPr>
+              <w:t>—</w:t>
+            </w:r>
+          </w:p>
+        </w:tc>
+        <w:tc>
+          <w:tcPr>
+            <w:tcW w:w="1828" w:type="dxa"/>
             <w:tcBorders>
               <w:top w:val="single" w:sz="4" w:space="0" w:color="000000"/>
               <w:left w:val="single" w:sz="4" w:space="0" w:color="000000"/>
@@ -5643,7 +6001,7 @@
         </w:trPr>
         <w:tc>
           <w:tcPr>
-            <w:tcW w:w="500" w:type="dxa"/>
+            <w:tcW w:w="820" w:type="dxa"/>
             <w:tcBorders>
               <w:top w:val="single" w:sz="4" w:space="0" w:color="000000"/>
               <w:left w:val="single" w:sz="4" w:space="0" w:color="000000"/>
@@ -5675,7 +6033,7 @@
         </w:tc>
         <w:tc>
           <w:tcPr>
-            <w:tcW w:w="2400" w:type="dxa"/>
+            <w:tcW w:w="1800" w:type="dxa"/>
             <w:tcBorders>
               <w:top w:val="single" w:sz="4" w:space="0" w:color="000000"/>
               <w:left w:val="single" w:sz="4" w:space="0" w:color="000000"/>
@@ -5707,7 +6065,7 @@
         </w:tc>
         <w:tc>
           <w:tcPr>
-            <w:tcW w:w="3600" w:type="dxa"/>
+            <w:tcW w:w="2580" w:type="dxa"/>
             <w:tcBorders>
               <w:top w:val="single" w:sz="4" w:space="0" w:color="000000"/>
               <w:left w:val="single" w:sz="4" w:space="0" w:color="000000"/>
@@ -5739,7 +6097,39 @@
         </w:tc>
         <w:tc>
           <w:tcPr>
-            <w:tcW w:w="1788" w:type="dxa"/>
+            <w:tcW w:w="1260" w:type="dxa"/>
+            <w:tcBorders>
+              <w:top w:val="single" w:sz="4" w:space="0" w:color="000000"/>
+              <w:left w:val="single" w:sz="4" w:space="0" w:color="000000"/>
+              <w:bottom w:val="single" w:sz="4" w:space="0" w:color="000000"/>
+              <w:right w:val="single" w:sz="4" w:space="0" w:color="000000"/>
+            </w:tcBorders>
+            <w:tcMar>
+              <w:top w:w="40" w:type="dxa"/>
+              <w:left w:w="80" w:type="dxa"/>
+              <w:bottom w:w="40" w:type="dxa"/>
+              <w:right w:w="80" w:type="dxa"/>
+            </w:tcMar>
+            <w:vAlign w:val="center"/>
+          </w:tcPr>
+          <w:p>
+            <w:pPr>
+              <w:bidi/>
+              <w:jc w:val="center"/>
+            </w:pPr>
+            <w:r>
+              <w:rPr>
+                <w:sz w:val="22"/>
+                <w:szCs w:val="22"/>
+                <w:rtl/>
+              </w:rPr>
+              <w:t>۲</w:t>
+            </w:r>
+          </w:p>
+        </w:tc>
+        <w:tc>
+          <w:tcPr>
+            <w:tcW w:w="1828" w:type="dxa"/>
             <w:tcBorders>
               <w:top w:val="single" w:sz="4" w:space="0" w:color="000000"/>
               <w:left w:val="single" w:sz="4" w:space="0" w:color="000000"/>
@@ -5776,7 +6166,7 @@
         </w:trPr>
         <w:tc>
           <w:tcPr>
-            <w:tcW w:w="500" w:type="dxa"/>
+            <w:tcW w:w="820" w:type="dxa"/>
             <w:tcBorders>
               <w:top w:val="single" w:sz="4" w:space="0" w:color="000000"/>
               <w:left w:val="single" w:sz="4" w:space="0" w:color="000000"/>
@@ -5808,31 +6198,31 @@
         </w:tc>
         <w:tc>
           <w:tcPr>
-            <w:tcW w:w="2400" w:type="dxa"/>
-            <w:tcBorders>
-              <w:top w:val="single" w:sz="4" w:space="0" w:color="000000"/>
-              <w:left w:val="single" w:sz="4" w:space="0" w:color="000000"/>
-              <w:bottom w:val="single" w:sz="4" w:space="0" w:color="000000"/>
-              <w:right w:val="single" w:sz="4" w:space="0" w:color="000000"/>
-            </w:tcBorders>
-            <w:tcMar>
-              <w:top w:w="40" w:type="dxa"/>
-              <w:left w:w="80" w:type="dxa"/>
-              <w:bottom w:w="40" w:type="dxa"/>
-              <w:right w:w="80" w:type="dxa"/>
-            </w:tcMar>
-            <w:vAlign w:val="center"/>
-          </w:tcPr>
-          <w:p>
-            <w:pPr>
-              <w:bidi/>
-              <w:jc w:val="center"/>
-            </w:pPr>
-          </w:p>
-        </w:tc>
-        <w:tc>
-          <w:tcPr>
-            <w:tcW w:w="3600" w:type="dxa"/>
+            <w:tcW w:w="1800" w:type="dxa"/>
+            <w:tcBorders>
+              <w:top w:val="single" w:sz="4" w:space="0" w:color="000000"/>
+              <w:left w:val="single" w:sz="4" w:space="0" w:color="000000"/>
+              <w:bottom w:val="single" w:sz="4" w:space="0" w:color="000000"/>
+              <w:right w:val="single" w:sz="4" w:space="0" w:color="000000"/>
+            </w:tcBorders>
+            <w:tcMar>
+              <w:top w:w="40" w:type="dxa"/>
+              <w:left w:w="80" w:type="dxa"/>
+              <w:bottom w:w="40" w:type="dxa"/>
+              <w:right w:w="80" w:type="dxa"/>
+            </w:tcMar>
+            <w:vAlign w:val="center"/>
+          </w:tcPr>
+          <w:p>
+            <w:pPr>
+              <w:bidi/>
+              <w:jc w:val="center"/>
+            </w:pPr>
+          </w:p>
+        </w:tc>
+        <w:tc>
+          <w:tcPr>
+            <w:tcW w:w="2580" w:type="dxa"/>
             <w:tcBorders>
               <w:top w:val="single" w:sz="4" w:space="0" w:color="000000"/>
               <w:left w:val="single" w:sz="4" w:space="0" w:color="000000"/>
@@ -5864,7 +6254,39 @@
         </w:tc>
         <w:tc>
           <w:tcPr>
-            <w:tcW w:w="1788" w:type="dxa"/>
+            <w:tcW w:w="1260" w:type="dxa"/>
+            <w:tcBorders>
+              <w:top w:val="single" w:sz="4" w:space="0" w:color="000000"/>
+              <w:left w:val="single" w:sz="4" w:space="0" w:color="000000"/>
+              <w:bottom w:val="single" w:sz="4" w:space="0" w:color="000000"/>
+              <w:right w:val="single" w:sz="4" w:space="0" w:color="000000"/>
+            </w:tcBorders>
+            <w:tcMar>
+              <w:top w:w="40" w:type="dxa"/>
+              <w:left w:w="80" w:type="dxa"/>
+              <w:bottom w:w="40" w:type="dxa"/>
+              <w:right w:w="80" w:type="dxa"/>
+            </w:tcMar>
+            <w:vAlign w:val="center"/>
+          </w:tcPr>
+          <w:p>
+            <w:pPr>
+              <w:bidi/>
+              <w:jc w:val="center"/>
+            </w:pPr>
+            <w:r>
+              <w:rPr>
+                <w:sz w:val="22"/>
+                <w:szCs w:val="22"/>
+                <w:rtl/>
+              </w:rPr>
+              <w:t>۲</w:t>
+            </w:r>
+          </w:p>
+        </w:tc>
+        <w:tc>
+          <w:tcPr>
+            <w:tcW w:w="1828" w:type="dxa"/>
             <w:tcBorders>
               <w:top w:val="single" w:sz="4" w:space="0" w:color="000000"/>
               <w:left w:val="single" w:sz="4" w:space="0" w:color="000000"/>
@@ -5901,7 +6323,7 @@
         </w:trPr>
         <w:tc>
           <w:tcPr>
-            <w:tcW w:w="500" w:type="dxa"/>
+            <w:tcW w:w="820" w:type="dxa"/>
             <w:tcBorders>
               <w:top w:val="single" w:sz="4" w:space="0" w:color="000000"/>
               <w:left w:val="single" w:sz="4" w:space="0" w:color="000000"/>
@@ -5933,31 +6355,31 @@
         </w:tc>
         <w:tc>
           <w:tcPr>
-            <w:tcW w:w="2400" w:type="dxa"/>
-            <w:tcBorders>
-              <w:top w:val="single" w:sz="4" w:space="0" w:color="000000"/>
-              <w:left w:val="single" w:sz="4" w:space="0" w:color="000000"/>
-              <w:bottom w:val="single" w:sz="4" w:space="0" w:color="000000"/>
-              <w:right w:val="single" w:sz="4" w:space="0" w:color="000000"/>
-            </w:tcBorders>
-            <w:tcMar>
-              <w:top w:w="40" w:type="dxa"/>
-              <w:left w:w="80" w:type="dxa"/>
-              <w:bottom w:w="40" w:type="dxa"/>
-              <w:right w:w="80" w:type="dxa"/>
-            </w:tcMar>
-            <w:vAlign w:val="center"/>
-          </w:tcPr>
-          <w:p>
-            <w:pPr>
-              <w:bidi/>
-              <w:jc w:val="center"/>
-            </w:pPr>
-          </w:p>
-        </w:tc>
-        <w:tc>
-          <w:tcPr>
-            <w:tcW w:w="3600" w:type="dxa"/>
+            <w:tcW w:w="1800" w:type="dxa"/>
+            <w:tcBorders>
+              <w:top w:val="single" w:sz="4" w:space="0" w:color="000000"/>
+              <w:left w:val="single" w:sz="4" w:space="0" w:color="000000"/>
+              <w:bottom w:val="single" w:sz="4" w:space="0" w:color="000000"/>
+              <w:right w:val="single" w:sz="4" w:space="0" w:color="000000"/>
+            </w:tcBorders>
+            <w:tcMar>
+              <w:top w:w="40" w:type="dxa"/>
+              <w:left w:w="80" w:type="dxa"/>
+              <w:bottom w:w="40" w:type="dxa"/>
+              <w:right w:w="80" w:type="dxa"/>
+            </w:tcMar>
+            <w:vAlign w:val="center"/>
+          </w:tcPr>
+          <w:p>
+            <w:pPr>
+              <w:bidi/>
+              <w:jc w:val="center"/>
+            </w:pPr>
+          </w:p>
+        </w:tc>
+        <w:tc>
+          <w:tcPr>
+            <w:tcW w:w="2580" w:type="dxa"/>
             <w:tcBorders>
               <w:top w:val="single" w:sz="4" w:space="0" w:color="000000"/>
               <w:left w:val="single" w:sz="4" w:space="0" w:color="000000"/>
@@ -5997,7 +6419,39 @@
         </w:tc>
         <w:tc>
           <w:tcPr>
-            <w:tcW w:w="1788" w:type="dxa"/>
+            <w:tcW w:w="1260" w:type="dxa"/>
+            <w:tcBorders>
+              <w:top w:val="single" w:sz="4" w:space="0" w:color="000000"/>
+              <w:left w:val="single" w:sz="4" w:space="0" w:color="000000"/>
+              <w:bottom w:val="single" w:sz="4" w:space="0" w:color="000000"/>
+              <w:right w:val="single" w:sz="4" w:space="0" w:color="000000"/>
+            </w:tcBorders>
+            <w:tcMar>
+              <w:top w:w="40" w:type="dxa"/>
+              <w:left w:w="80" w:type="dxa"/>
+              <w:bottom w:w="40" w:type="dxa"/>
+              <w:right w:w="80" w:type="dxa"/>
+            </w:tcMar>
+            <w:vAlign w:val="center"/>
+          </w:tcPr>
+          <w:p>
+            <w:pPr>
+              <w:bidi/>
+              <w:jc w:val="center"/>
+            </w:pPr>
+            <w:r>
+              <w:rPr>
+                <w:sz w:val="22"/>
+                <w:szCs w:val="22"/>
+                <w:rtl/>
+              </w:rPr>
+              <w:t>۵</w:t>
+            </w:r>
+          </w:p>
+        </w:tc>
+        <w:tc>
+          <w:tcPr>
+            <w:tcW w:w="1828" w:type="dxa"/>
             <w:tcBorders>
               <w:top w:val="single" w:sz="4" w:space="0" w:color="000000"/>
               <w:left w:val="single" w:sz="4" w:space="0" w:color="000000"/>
@@ -6034,7 +6488,7 @@
         </w:trPr>
         <w:tc>
           <w:tcPr>
-            <w:tcW w:w="500" w:type="dxa"/>
+            <w:tcW w:w="820" w:type="dxa"/>
             <w:tcBorders>
               <w:top w:val="single" w:sz="4" w:space="0" w:color="000000"/>
               <w:left w:val="single" w:sz="4" w:space="0" w:color="000000"/>
@@ -6066,31 +6520,31 @@
         </w:tc>
         <w:tc>
           <w:tcPr>
-            <w:tcW w:w="2400" w:type="dxa"/>
-            <w:tcBorders>
-              <w:top w:val="single" w:sz="4" w:space="0" w:color="000000"/>
-              <w:left w:val="single" w:sz="4" w:space="0" w:color="000000"/>
-              <w:bottom w:val="single" w:sz="4" w:space="0" w:color="000000"/>
-              <w:right w:val="single" w:sz="4" w:space="0" w:color="000000"/>
-            </w:tcBorders>
-            <w:tcMar>
-              <w:top w:w="40" w:type="dxa"/>
-              <w:left w:w="80" w:type="dxa"/>
-              <w:bottom w:w="40" w:type="dxa"/>
-              <w:right w:w="80" w:type="dxa"/>
-            </w:tcMar>
-            <w:vAlign w:val="center"/>
-          </w:tcPr>
-          <w:p>
-            <w:pPr>
-              <w:bidi/>
-              <w:jc w:val="center"/>
-            </w:pPr>
-          </w:p>
-        </w:tc>
-        <w:tc>
-          <w:tcPr>
-            <w:tcW w:w="3600" w:type="dxa"/>
+            <w:tcW w:w="1800" w:type="dxa"/>
+            <w:tcBorders>
+              <w:top w:val="single" w:sz="4" w:space="0" w:color="000000"/>
+              <w:left w:val="single" w:sz="4" w:space="0" w:color="000000"/>
+              <w:bottom w:val="single" w:sz="4" w:space="0" w:color="000000"/>
+              <w:right w:val="single" w:sz="4" w:space="0" w:color="000000"/>
+            </w:tcBorders>
+            <w:tcMar>
+              <w:top w:w="40" w:type="dxa"/>
+              <w:left w:w="80" w:type="dxa"/>
+              <w:bottom w:w="40" w:type="dxa"/>
+              <w:right w:w="80" w:type="dxa"/>
+            </w:tcMar>
+            <w:vAlign w:val="center"/>
+          </w:tcPr>
+          <w:p>
+            <w:pPr>
+              <w:bidi/>
+              <w:jc w:val="center"/>
+            </w:pPr>
+          </w:p>
+        </w:tc>
+        <w:tc>
+          <w:tcPr>
+            <w:tcW w:w="2580" w:type="dxa"/>
             <w:tcBorders>
               <w:top w:val="single" w:sz="4" w:space="0" w:color="000000"/>
               <w:left w:val="single" w:sz="4" w:space="0" w:color="000000"/>
@@ -6122,7 +6576,39 @@
         </w:tc>
         <w:tc>
           <w:tcPr>
-            <w:tcW w:w="1788" w:type="dxa"/>
+            <w:tcW w:w="1260" w:type="dxa"/>
+            <w:tcBorders>
+              <w:top w:val="single" w:sz="4" w:space="0" w:color="000000"/>
+              <w:left w:val="single" w:sz="4" w:space="0" w:color="000000"/>
+              <w:bottom w:val="single" w:sz="4" w:space="0" w:color="000000"/>
+              <w:right w:val="single" w:sz="4" w:space="0" w:color="000000"/>
+            </w:tcBorders>
+            <w:tcMar>
+              <w:top w:w="40" w:type="dxa"/>
+              <w:left w:w="80" w:type="dxa"/>
+              <w:bottom w:w="40" w:type="dxa"/>
+              <w:right w:w="80" w:type="dxa"/>
+            </w:tcMar>
+            <w:vAlign w:val="center"/>
+          </w:tcPr>
+          <w:p>
+            <w:pPr>
+              <w:bidi/>
+              <w:jc w:val="center"/>
+            </w:pPr>
+            <w:r>
+              <w:rPr>
+                <w:sz w:val="22"/>
+                <w:szCs w:val="22"/>
+                <w:rtl/>
+              </w:rPr>
+              <w:t>۵</w:t>
+            </w:r>
+          </w:p>
+        </w:tc>
+        <w:tc>
+          <w:tcPr>
+            <w:tcW w:w="1828" w:type="dxa"/>
             <w:tcBorders>
               <w:top w:val="single" w:sz="4" w:space="0" w:color="000000"/>
               <w:left w:val="single" w:sz="4" w:space="0" w:color="000000"/>
@@ -6159,7 +6645,7 @@
         </w:trPr>
         <w:tc>
           <w:tcPr>
-            <w:tcW w:w="500" w:type="dxa"/>
+            <w:tcW w:w="820" w:type="dxa"/>
             <w:tcBorders>
               <w:top w:val="single" w:sz="4" w:space="0" w:color="000000"/>
               <w:left w:val="single" w:sz="4" w:space="0" w:color="000000"/>
@@ -6191,7 +6677,7 @@
         </w:tc>
         <w:tc>
           <w:tcPr>
-            <w:tcW w:w="2400" w:type="dxa"/>
+            <w:tcW w:w="1800" w:type="dxa"/>
             <w:tcBorders>
               <w:top w:val="single" w:sz="4" w:space="0" w:color="000000"/>
               <w:left w:val="single" w:sz="4" w:space="0" w:color="000000"/>
@@ -6223,7 +6709,7 @@
         </w:tc>
         <w:tc>
           <w:tcPr>
-            <w:tcW w:w="3600" w:type="dxa"/>
+            <w:tcW w:w="2580" w:type="dxa"/>
             <w:tcBorders>
               <w:top w:val="single" w:sz="4" w:space="0" w:color="000000"/>
               <w:left w:val="single" w:sz="4" w:space="0" w:color="000000"/>
@@ -6255,7 +6741,39 @@
         </w:tc>
         <w:tc>
           <w:tcPr>
-            <w:tcW w:w="1788" w:type="dxa"/>
+            <w:tcW w:w="1260" w:type="dxa"/>
+            <w:tcBorders>
+              <w:top w:val="single" w:sz="4" w:space="0" w:color="000000"/>
+              <w:left w:val="single" w:sz="4" w:space="0" w:color="000000"/>
+              <w:bottom w:val="single" w:sz="4" w:space="0" w:color="000000"/>
+              <w:right w:val="single" w:sz="4" w:space="0" w:color="000000"/>
+            </w:tcBorders>
+            <w:tcMar>
+              <w:top w:w="40" w:type="dxa"/>
+              <w:left w:w="80" w:type="dxa"/>
+              <w:bottom w:w="40" w:type="dxa"/>
+              <w:right w:w="80" w:type="dxa"/>
+            </w:tcMar>
+            <w:vAlign w:val="center"/>
+          </w:tcPr>
+          <w:p>
+            <w:pPr>
+              <w:bidi/>
+              <w:jc w:val="center"/>
+            </w:pPr>
+            <w:r>
+              <w:rPr>
+                <w:sz w:val="22"/>
+                <w:szCs w:val="22"/>
+                <w:rtl/>
+              </w:rPr>
+              <w:t>۹</w:t>
+            </w:r>
+          </w:p>
+        </w:tc>
+        <w:tc>
+          <w:tcPr>
+            <w:tcW w:w="1828" w:type="dxa"/>
             <w:tcBorders>
               <w:top w:val="single" w:sz="4" w:space="0" w:color="000000"/>
               <w:left w:val="single" w:sz="4" w:space="0" w:color="000000"/>
@@ -6292,7 +6810,7 @@
         </w:trPr>
         <w:tc>
           <w:tcPr>
-            <w:tcW w:w="500" w:type="dxa"/>
+            <w:tcW w:w="820" w:type="dxa"/>
             <w:tcBorders>
               <w:top w:val="single" w:sz="4" w:space="0" w:color="000000"/>
               <w:left w:val="single" w:sz="4" w:space="0" w:color="000000"/>
@@ -6324,31 +6842,31 @@
         </w:tc>
         <w:tc>
           <w:tcPr>
-            <w:tcW w:w="2400" w:type="dxa"/>
-            <w:tcBorders>
-              <w:top w:val="single" w:sz="4" w:space="0" w:color="000000"/>
-              <w:left w:val="single" w:sz="4" w:space="0" w:color="000000"/>
-              <w:bottom w:val="single" w:sz="4" w:space="0" w:color="000000"/>
-              <w:right w:val="single" w:sz="4" w:space="0" w:color="000000"/>
-            </w:tcBorders>
-            <w:tcMar>
-              <w:top w:w="40" w:type="dxa"/>
-              <w:left w:w="80" w:type="dxa"/>
-              <w:bottom w:w="40" w:type="dxa"/>
-              <w:right w:w="80" w:type="dxa"/>
-            </w:tcMar>
-            <w:vAlign w:val="center"/>
-          </w:tcPr>
-          <w:p>
-            <w:pPr>
-              <w:bidi/>
-              <w:jc w:val="center"/>
-            </w:pPr>
-          </w:p>
-        </w:tc>
-        <w:tc>
-          <w:tcPr>
-            <w:tcW w:w="3600" w:type="dxa"/>
+            <w:tcW w:w="1800" w:type="dxa"/>
+            <w:tcBorders>
+              <w:top w:val="single" w:sz="4" w:space="0" w:color="000000"/>
+              <w:left w:val="single" w:sz="4" w:space="0" w:color="000000"/>
+              <w:bottom w:val="single" w:sz="4" w:space="0" w:color="000000"/>
+              <w:right w:val="single" w:sz="4" w:space="0" w:color="000000"/>
+            </w:tcBorders>
+            <w:tcMar>
+              <w:top w:w="40" w:type="dxa"/>
+              <w:left w:w="80" w:type="dxa"/>
+              <w:bottom w:w="40" w:type="dxa"/>
+              <w:right w:w="80" w:type="dxa"/>
+            </w:tcMar>
+            <w:vAlign w:val="center"/>
+          </w:tcPr>
+          <w:p>
+            <w:pPr>
+              <w:bidi/>
+              <w:jc w:val="center"/>
+            </w:pPr>
+          </w:p>
+        </w:tc>
+        <w:tc>
+          <w:tcPr>
+            <w:tcW w:w="2580" w:type="dxa"/>
             <w:tcBorders>
               <w:top w:val="single" w:sz="4" w:space="0" w:color="000000"/>
               <w:left w:val="single" w:sz="4" w:space="0" w:color="000000"/>
@@ -6380,7 +6898,39 @@
         </w:tc>
         <w:tc>
           <w:tcPr>
-            <w:tcW w:w="1788" w:type="dxa"/>
+            <w:tcW w:w="1260" w:type="dxa"/>
+            <w:tcBorders>
+              <w:top w:val="single" w:sz="4" w:space="0" w:color="000000"/>
+              <w:left w:val="single" w:sz="4" w:space="0" w:color="000000"/>
+              <w:bottom w:val="single" w:sz="4" w:space="0" w:color="000000"/>
+              <w:right w:val="single" w:sz="4" w:space="0" w:color="000000"/>
+            </w:tcBorders>
+            <w:tcMar>
+              <w:top w:w="40" w:type="dxa"/>
+              <w:left w:w="80" w:type="dxa"/>
+              <w:bottom w:w="40" w:type="dxa"/>
+              <w:right w:w="80" w:type="dxa"/>
+            </w:tcMar>
+            <w:vAlign w:val="center"/>
+          </w:tcPr>
+          <w:p>
+            <w:pPr>
+              <w:bidi/>
+              <w:jc w:val="center"/>
+            </w:pPr>
+            <w:r>
+              <w:rPr>
+                <w:sz w:val="22"/>
+                <w:szCs w:val="22"/>
+                <w:rtl/>
+              </w:rPr>
+              <w:t>۹</w:t>
+            </w:r>
+          </w:p>
+        </w:tc>
+        <w:tc>
+          <w:tcPr>
+            <w:tcW w:w="1828" w:type="dxa"/>
             <w:tcBorders>
               <w:top w:val="single" w:sz="4" w:space="0" w:color="000000"/>
               <w:left w:val="single" w:sz="4" w:space="0" w:color="000000"/>
@@ -6417,7 +6967,7 @@
         </w:trPr>
         <w:tc>
           <w:tcPr>
-            <w:tcW w:w="500" w:type="dxa"/>
+            <w:tcW w:w="820" w:type="dxa"/>
             <w:tcBorders>
               <w:top w:val="single" w:sz="4" w:space="0" w:color="000000"/>
               <w:left w:val="single" w:sz="4" w:space="0" w:color="000000"/>
@@ -6449,31 +6999,31 @@
         </w:tc>
         <w:tc>
           <w:tcPr>
-            <w:tcW w:w="2400" w:type="dxa"/>
-            <w:tcBorders>
-              <w:top w:val="single" w:sz="4" w:space="0" w:color="000000"/>
-              <w:left w:val="single" w:sz="4" w:space="0" w:color="000000"/>
-              <w:bottom w:val="single" w:sz="4" w:space="0" w:color="000000"/>
-              <w:right w:val="single" w:sz="4" w:space="0" w:color="000000"/>
-            </w:tcBorders>
-            <w:tcMar>
-              <w:top w:w="40" w:type="dxa"/>
-              <w:left w:w="80" w:type="dxa"/>
-              <w:bottom w:w="40" w:type="dxa"/>
-              <w:right w:w="80" w:type="dxa"/>
-            </w:tcMar>
-            <w:vAlign w:val="center"/>
-          </w:tcPr>
-          <w:p>
-            <w:pPr>
-              <w:bidi/>
-              <w:jc w:val="center"/>
-            </w:pPr>
-          </w:p>
-        </w:tc>
-        <w:tc>
-          <w:tcPr>
-            <w:tcW w:w="3600" w:type="dxa"/>
+            <w:tcW w:w="1800" w:type="dxa"/>
+            <w:tcBorders>
+              <w:top w:val="single" w:sz="4" w:space="0" w:color="000000"/>
+              <w:left w:val="single" w:sz="4" w:space="0" w:color="000000"/>
+              <w:bottom w:val="single" w:sz="4" w:space="0" w:color="000000"/>
+              <w:right w:val="single" w:sz="4" w:space="0" w:color="000000"/>
+            </w:tcBorders>
+            <w:tcMar>
+              <w:top w:w="40" w:type="dxa"/>
+              <w:left w:w="80" w:type="dxa"/>
+              <w:bottom w:w="40" w:type="dxa"/>
+              <w:right w:w="80" w:type="dxa"/>
+            </w:tcMar>
+            <w:vAlign w:val="center"/>
+          </w:tcPr>
+          <w:p>
+            <w:pPr>
+              <w:bidi/>
+              <w:jc w:val="center"/>
+            </w:pPr>
+          </w:p>
+        </w:tc>
+        <w:tc>
+          <w:tcPr>
+            <w:tcW w:w="2580" w:type="dxa"/>
             <w:tcBorders>
               <w:top w:val="single" w:sz="4" w:space="0" w:color="000000"/>
               <w:left w:val="single" w:sz="4" w:space="0" w:color="000000"/>
@@ -6513,7 +7063,39 @@
         </w:tc>
         <w:tc>
           <w:tcPr>
-            <w:tcW w:w="1788" w:type="dxa"/>
+            <w:tcW w:w="1260" w:type="dxa"/>
+            <w:tcBorders>
+              <w:top w:val="single" w:sz="4" w:space="0" w:color="000000"/>
+              <w:left w:val="single" w:sz="4" w:space="0" w:color="000000"/>
+              <w:bottom w:val="single" w:sz="4" w:space="0" w:color="000000"/>
+              <w:right w:val="single" w:sz="4" w:space="0" w:color="000000"/>
+            </w:tcBorders>
+            <w:tcMar>
+              <w:top w:w="40" w:type="dxa"/>
+              <w:left w:w="80" w:type="dxa"/>
+              <w:bottom w:w="40" w:type="dxa"/>
+              <w:right w:w="80" w:type="dxa"/>
+            </w:tcMar>
+            <w:vAlign w:val="center"/>
+          </w:tcPr>
+          <w:p>
+            <w:pPr>
+              <w:bidi/>
+              <w:jc w:val="center"/>
+            </w:pPr>
+            <w:r>
+              <w:rPr>
+                <w:sz w:val="22"/>
+                <w:szCs w:val="22"/>
+                <w:rtl/>
+              </w:rPr>
+              <w:t>۷</w:t>
+            </w:r>
+          </w:p>
+        </w:tc>
+        <w:tc>
+          <w:tcPr>
+            <w:tcW w:w="1828" w:type="dxa"/>
             <w:tcBorders>
               <w:top w:val="single" w:sz="4" w:space="0" w:color="000000"/>
               <w:left w:val="single" w:sz="4" w:space="0" w:color="000000"/>
@@ -6550,7 +7132,7 @@
         </w:trPr>
         <w:tc>
           <w:tcPr>
-            <w:tcW w:w="500" w:type="dxa"/>
+            <w:tcW w:w="820" w:type="dxa"/>
             <w:tcBorders>
               <w:top w:val="single" w:sz="4" w:space="0" w:color="000000"/>
               <w:left w:val="single" w:sz="4" w:space="0" w:color="000000"/>
@@ -6582,31 +7164,31 @@
         </w:tc>
         <w:tc>
           <w:tcPr>
-            <w:tcW w:w="2400" w:type="dxa"/>
-            <w:tcBorders>
-              <w:top w:val="single" w:sz="4" w:space="0" w:color="000000"/>
-              <w:left w:val="single" w:sz="4" w:space="0" w:color="000000"/>
-              <w:bottom w:val="single" w:sz="4" w:space="0" w:color="000000"/>
-              <w:right w:val="single" w:sz="4" w:space="0" w:color="000000"/>
-            </w:tcBorders>
-            <w:tcMar>
-              <w:top w:w="40" w:type="dxa"/>
-              <w:left w:w="80" w:type="dxa"/>
-              <w:bottom w:w="40" w:type="dxa"/>
-              <w:right w:w="80" w:type="dxa"/>
-            </w:tcMar>
-            <w:vAlign w:val="center"/>
-          </w:tcPr>
-          <w:p>
-            <w:pPr>
-              <w:bidi/>
-              <w:jc w:val="center"/>
-            </w:pPr>
-          </w:p>
-        </w:tc>
-        <w:tc>
-          <w:tcPr>
-            <w:tcW w:w="3600" w:type="dxa"/>
+            <w:tcW w:w="1800" w:type="dxa"/>
+            <w:tcBorders>
+              <w:top w:val="single" w:sz="4" w:space="0" w:color="000000"/>
+              <w:left w:val="single" w:sz="4" w:space="0" w:color="000000"/>
+              <w:bottom w:val="single" w:sz="4" w:space="0" w:color="000000"/>
+              <w:right w:val="single" w:sz="4" w:space="0" w:color="000000"/>
+            </w:tcBorders>
+            <w:tcMar>
+              <w:top w:w="40" w:type="dxa"/>
+              <w:left w:w="80" w:type="dxa"/>
+              <w:bottom w:w="40" w:type="dxa"/>
+              <w:right w:w="80" w:type="dxa"/>
+            </w:tcMar>
+            <w:vAlign w:val="center"/>
+          </w:tcPr>
+          <w:p>
+            <w:pPr>
+              <w:bidi/>
+              <w:jc w:val="center"/>
+            </w:pPr>
+          </w:p>
+        </w:tc>
+        <w:tc>
+          <w:tcPr>
+            <w:tcW w:w="2580" w:type="dxa"/>
             <w:tcBorders>
               <w:top w:val="single" w:sz="4" w:space="0" w:color="000000"/>
               <w:left w:val="single" w:sz="4" w:space="0" w:color="000000"/>
@@ -6638,7 +7220,39 @@
         </w:tc>
         <w:tc>
           <w:tcPr>
-            <w:tcW w:w="1788" w:type="dxa"/>
+            <w:tcW w:w="1260" w:type="dxa"/>
+            <w:tcBorders>
+              <w:top w:val="single" w:sz="4" w:space="0" w:color="000000"/>
+              <w:left w:val="single" w:sz="4" w:space="0" w:color="000000"/>
+              <w:bottom w:val="single" w:sz="4" w:space="0" w:color="000000"/>
+              <w:right w:val="single" w:sz="4" w:space="0" w:color="000000"/>
+            </w:tcBorders>
+            <w:tcMar>
+              <w:top w:w="40" w:type="dxa"/>
+              <w:left w:w="80" w:type="dxa"/>
+              <w:bottom w:w="40" w:type="dxa"/>
+              <w:right w:w="80" w:type="dxa"/>
+            </w:tcMar>
+            <w:vAlign w:val="center"/>
+          </w:tcPr>
+          <w:p>
+            <w:pPr>
+              <w:bidi/>
+              <w:jc w:val="center"/>
+            </w:pPr>
+            <w:r>
+              <w:rPr>
+                <w:sz w:val="22"/>
+                <w:szCs w:val="22"/>
+                <w:rtl/>
+              </w:rPr>
+              <w:t>۱</w:t>
+            </w:r>
+          </w:p>
+        </w:tc>
+        <w:tc>
+          <w:tcPr>
+            <w:tcW w:w="1828" w:type="dxa"/>
             <w:tcBorders>
               <w:top w:val="single" w:sz="4" w:space="0" w:color="000000"/>
               <w:left w:val="single" w:sz="4" w:space="0" w:color="000000"/>
@@ -6675,7 +7289,7 @@
         </w:trPr>
         <w:tc>
           <w:tcPr>
-            <w:tcW w:w="500" w:type="dxa"/>
+            <w:tcW w:w="820" w:type="dxa"/>
             <w:tcBorders>
               <w:top w:val="single" w:sz="4" w:space="0" w:color="000000"/>
               <w:left w:val="single" w:sz="4" w:space="0" w:color="000000"/>
@@ -6707,7 +7321,7 @@
         </w:tc>
         <w:tc>
           <w:tcPr>
-            <w:tcW w:w="2400" w:type="dxa"/>
+            <w:tcW w:w="1800" w:type="dxa"/>
             <w:tcBorders>
               <w:top w:val="single" w:sz="4" w:space="0" w:color="000000"/>
               <w:left w:val="single" w:sz="4" w:space="0" w:color="000000"/>
@@ -6739,7 +7353,7 @@
         </w:tc>
         <w:tc>
           <w:tcPr>
-            <w:tcW w:w="3600" w:type="dxa"/>
+            <w:tcW w:w="2580" w:type="dxa"/>
             <w:tcBorders>
               <w:top w:val="single" w:sz="4" w:space="0" w:color="000000"/>
               <w:left w:val="single" w:sz="4" w:space="0" w:color="000000"/>
@@ -6771,7 +7385,39 @@
         </w:tc>
         <w:tc>
           <w:tcPr>
-            <w:tcW w:w="1788" w:type="dxa"/>
+            <w:tcW w:w="1260" w:type="dxa"/>
+            <w:tcBorders>
+              <w:top w:val="single" w:sz="4" w:space="0" w:color="000000"/>
+              <w:left w:val="single" w:sz="4" w:space="0" w:color="000000"/>
+              <w:bottom w:val="single" w:sz="4" w:space="0" w:color="000000"/>
+              <w:right w:val="single" w:sz="4" w:space="0" w:color="000000"/>
+            </w:tcBorders>
+            <w:tcMar>
+              <w:top w:w="40" w:type="dxa"/>
+              <w:left w:w="80" w:type="dxa"/>
+              <w:bottom w:w="40" w:type="dxa"/>
+              <w:right w:w="80" w:type="dxa"/>
+            </w:tcMar>
+            <w:vAlign w:val="center"/>
+          </w:tcPr>
+          <w:p>
+            <w:pPr>
+              <w:bidi/>
+              <w:jc w:val="center"/>
+            </w:pPr>
+            <w:r>
+              <w:rPr>
+                <w:sz w:val="22"/>
+                <w:szCs w:val="22"/>
+                <w:rtl/>
+              </w:rPr>
+              <w:t>۷</w:t>
+            </w:r>
+          </w:p>
+        </w:tc>
+        <w:tc>
+          <w:tcPr>
+            <w:tcW w:w="1828" w:type="dxa"/>
             <w:tcBorders>
               <w:top w:val="single" w:sz="4" w:space="0" w:color="000000"/>
               <w:left w:val="single" w:sz="4" w:space="0" w:color="000000"/>
@@ -6808,7 +7454,7 @@
         </w:trPr>
         <w:tc>
           <w:tcPr>
-            <w:tcW w:w="500" w:type="dxa"/>
+            <w:tcW w:w="820" w:type="dxa"/>
             <w:tcBorders>
               <w:top w:val="single" w:sz="4" w:space="0" w:color="000000"/>
               <w:left w:val="single" w:sz="4" w:space="0" w:color="000000"/>
@@ -6840,31 +7486,31 @@
         </w:tc>
         <w:tc>
           <w:tcPr>
-            <w:tcW w:w="2400" w:type="dxa"/>
-            <w:tcBorders>
-              <w:top w:val="single" w:sz="4" w:space="0" w:color="000000"/>
-              <w:left w:val="single" w:sz="4" w:space="0" w:color="000000"/>
-              <w:bottom w:val="single" w:sz="4" w:space="0" w:color="000000"/>
-              <w:right w:val="single" w:sz="4" w:space="0" w:color="000000"/>
-            </w:tcBorders>
-            <w:tcMar>
-              <w:top w:w="40" w:type="dxa"/>
-              <w:left w:w="80" w:type="dxa"/>
-              <w:bottom w:w="40" w:type="dxa"/>
-              <w:right w:w="80" w:type="dxa"/>
-            </w:tcMar>
-            <w:vAlign w:val="center"/>
-          </w:tcPr>
-          <w:p>
-            <w:pPr>
-              <w:bidi/>
-              <w:jc w:val="center"/>
-            </w:pPr>
-          </w:p>
-        </w:tc>
-        <w:tc>
-          <w:tcPr>
-            <w:tcW w:w="3600" w:type="dxa"/>
+            <w:tcW w:w="1800" w:type="dxa"/>
+            <w:tcBorders>
+              <w:top w:val="single" w:sz="4" w:space="0" w:color="000000"/>
+              <w:left w:val="single" w:sz="4" w:space="0" w:color="000000"/>
+              <w:bottom w:val="single" w:sz="4" w:space="0" w:color="000000"/>
+              <w:right w:val="single" w:sz="4" w:space="0" w:color="000000"/>
+            </w:tcBorders>
+            <w:tcMar>
+              <w:top w:w="40" w:type="dxa"/>
+              <w:left w:w="80" w:type="dxa"/>
+              <w:bottom w:w="40" w:type="dxa"/>
+              <w:right w:w="80" w:type="dxa"/>
+            </w:tcMar>
+            <w:vAlign w:val="center"/>
+          </w:tcPr>
+          <w:p>
+            <w:pPr>
+              <w:bidi/>
+              <w:jc w:val="center"/>
+            </w:pPr>
+          </w:p>
+        </w:tc>
+        <w:tc>
+          <w:tcPr>
+            <w:tcW w:w="2580" w:type="dxa"/>
             <w:tcBorders>
               <w:top w:val="single" w:sz="4" w:space="0" w:color="000000"/>
               <w:left w:val="single" w:sz="4" w:space="0" w:color="000000"/>
@@ -6896,7 +7542,39 @@
         </w:tc>
         <w:tc>
           <w:tcPr>
-            <w:tcW w:w="1788" w:type="dxa"/>
+            <w:tcW w:w="1260" w:type="dxa"/>
+            <w:tcBorders>
+              <w:top w:val="single" w:sz="4" w:space="0" w:color="000000"/>
+              <w:left w:val="single" w:sz="4" w:space="0" w:color="000000"/>
+              <w:bottom w:val="single" w:sz="4" w:space="0" w:color="000000"/>
+              <w:right w:val="single" w:sz="4" w:space="0" w:color="000000"/>
+            </w:tcBorders>
+            <w:tcMar>
+              <w:top w:w="40" w:type="dxa"/>
+              <w:left w:w="80" w:type="dxa"/>
+              <w:bottom w:w="40" w:type="dxa"/>
+              <w:right w:w="80" w:type="dxa"/>
+            </w:tcMar>
+            <w:vAlign w:val="center"/>
+          </w:tcPr>
+          <w:p>
+            <w:pPr>
+              <w:bidi/>
+              <w:jc w:val="center"/>
+            </w:pPr>
+            <w:r>
+              <w:rPr>
+                <w:sz w:val="22"/>
+                <w:szCs w:val="22"/>
+                <w:rtl/>
+              </w:rPr>
+              <w:t>۷</w:t>
+            </w:r>
+          </w:p>
+        </w:tc>
+        <w:tc>
+          <w:tcPr>
+            <w:tcW w:w="1828" w:type="dxa"/>
             <w:tcBorders>
               <w:top w:val="single" w:sz="4" w:space="0" w:color="000000"/>
               <w:left w:val="single" w:sz="4" w:space="0" w:color="000000"/>
@@ -6933,7 +7611,7 @@
         </w:trPr>
         <w:tc>
           <w:tcPr>
-            <w:tcW w:w="500" w:type="dxa"/>
+            <w:tcW w:w="820" w:type="dxa"/>
             <w:tcBorders>
               <w:top w:val="single" w:sz="4" w:space="0" w:color="000000"/>
               <w:left w:val="single" w:sz="4" w:space="0" w:color="000000"/>
@@ -6965,31 +7643,31 @@
         </w:tc>
         <w:tc>
           <w:tcPr>
-            <w:tcW w:w="2400" w:type="dxa"/>
-            <w:tcBorders>
-              <w:top w:val="single" w:sz="4" w:space="0" w:color="000000"/>
-              <w:left w:val="single" w:sz="4" w:space="0" w:color="000000"/>
-              <w:bottom w:val="single" w:sz="4" w:space="0" w:color="000000"/>
-              <w:right w:val="single" w:sz="4" w:space="0" w:color="000000"/>
-            </w:tcBorders>
-            <w:tcMar>
-              <w:top w:w="40" w:type="dxa"/>
-              <w:left w:w="80" w:type="dxa"/>
-              <w:bottom w:w="40" w:type="dxa"/>
-              <w:right w:w="80" w:type="dxa"/>
-            </w:tcMar>
-            <w:vAlign w:val="center"/>
-          </w:tcPr>
-          <w:p>
-            <w:pPr>
-              <w:bidi/>
-              <w:jc w:val="center"/>
-            </w:pPr>
-          </w:p>
-        </w:tc>
-        <w:tc>
-          <w:tcPr>
-            <w:tcW w:w="3600" w:type="dxa"/>
+            <w:tcW w:w="1800" w:type="dxa"/>
+            <w:tcBorders>
+              <w:top w:val="single" w:sz="4" w:space="0" w:color="000000"/>
+              <w:left w:val="single" w:sz="4" w:space="0" w:color="000000"/>
+              <w:bottom w:val="single" w:sz="4" w:space="0" w:color="000000"/>
+              <w:right w:val="single" w:sz="4" w:space="0" w:color="000000"/>
+            </w:tcBorders>
+            <w:tcMar>
+              <w:top w:w="40" w:type="dxa"/>
+              <w:left w:w="80" w:type="dxa"/>
+              <w:bottom w:w="40" w:type="dxa"/>
+              <w:right w:w="80" w:type="dxa"/>
+            </w:tcMar>
+            <w:vAlign w:val="center"/>
+          </w:tcPr>
+          <w:p>
+            <w:pPr>
+              <w:bidi/>
+              <w:jc w:val="center"/>
+            </w:pPr>
+          </w:p>
+        </w:tc>
+        <w:tc>
+          <w:tcPr>
+            <w:tcW w:w="2580" w:type="dxa"/>
             <w:tcBorders>
               <w:top w:val="single" w:sz="4" w:space="0" w:color="000000"/>
               <w:left w:val="single" w:sz="4" w:space="0" w:color="000000"/>
@@ -7029,7 +7707,39 @@
         </w:tc>
         <w:tc>
           <w:tcPr>
-            <w:tcW w:w="1788" w:type="dxa"/>
+            <w:tcW w:w="1260" w:type="dxa"/>
+            <w:tcBorders>
+              <w:top w:val="single" w:sz="4" w:space="0" w:color="000000"/>
+              <w:left w:val="single" w:sz="4" w:space="0" w:color="000000"/>
+              <w:bottom w:val="single" w:sz="4" w:space="0" w:color="000000"/>
+              <w:right w:val="single" w:sz="4" w:space="0" w:color="000000"/>
+            </w:tcBorders>
+            <w:tcMar>
+              <w:top w:w="40" w:type="dxa"/>
+              <w:left w:w="80" w:type="dxa"/>
+              <w:bottom w:w="40" w:type="dxa"/>
+              <w:right w:w="80" w:type="dxa"/>
+            </w:tcMar>
+            <w:vAlign w:val="center"/>
+          </w:tcPr>
+          <w:p>
+            <w:pPr>
+              <w:bidi/>
+              <w:jc w:val="center"/>
+            </w:pPr>
+            <w:r>
+              <w:rPr>
+                <w:sz w:val="22"/>
+                <w:szCs w:val="22"/>
+                <w:rtl/>
+              </w:rPr>
+              <w:t>۷</w:t>
+            </w:r>
+          </w:p>
+        </w:tc>
+        <w:tc>
+          <w:tcPr>
+            <w:tcW w:w="1828" w:type="dxa"/>
             <w:tcBorders>
               <w:top w:val="single" w:sz="4" w:space="0" w:color="000000"/>
               <w:left w:val="single" w:sz="4" w:space="0" w:color="000000"/>
@@ -7066,7 +7776,7 @@
         </w:trPr>
         <w:tc>
           <w:tcPr>
-            <w:tcW w:w="500" w:type="dxa"/>
+            <w:tcW w:w="820" w:type="dxa"/>
             <w:tcBorders>
               <w:top w:val="single" w:sz="4" w:space="0" w:color="000000"/>
               <w:left w:val="single" w:sz="4" w:space="0" w:color="000000"/>
@@ -7098,7 +7808,7 @@
         </w:tc>
         <w:tc>
           <w:tcPr>
-            <w:tcW w:w="2400" w:type="dxa"/>
+            <w:tcW w:w="1800" w:type="dxa"/>
             <w:tcBorders>
               <w:top w:val="single" w:sz="4" w:space="0" w:color="000000"/>
               <w:left w:val="single" w:sz="4" w:space="0" w:color="000000"/>
@@ -7130,7 +7840,7 @@
         </w:tc>
         <w:tc>
           <w:tcPr>
-            <w:tcW w:w="3600" w:type="dxa"/>
+            <w:tcW w:w="2580" w:type="dxa"/>
             <w:tcBorders>
               <w:top w:val="single" w:sz="4" w:space="0" w:color="000000"/>
               <w:left w:val="single" w:sz="4" w:space="0" w:color="000000"/>
@@ -7162,7 +7872,39 @@
         </w:tc>
         <w:tc>
           <w:tcPr>
-            <w:tcW w:w="1788" w:type="dxa"/>
+            <w:tcW w:w="1260" w:type="dxa"/>
+            <w:tcBorders>
+              <w:top w:val="single" w:sz="4" w:space="0" w:color="000000"/>
+              <w:left w:val="single" w:sz="4" w:space="0" w:color="000000"/>
+              <w:bottom w:val="single" w:sz="4" w:space="0" w:color="000000"/>
+              <w:right w:val="single" w:sz="4" w:space="0" w:color="000000"/>
+            </w:tcBorders>
+            <w:tcMar>
+              <w:top w:w="40" w:type="dxa"/>
+              <w:left w:w="80" w:type="dxa"/>
+              <w:bottom w:w="40" w:type="dxa"/>
+              <w:right w:w="80" w:type="dxa"/>
+            </w:tcMar>
+            <w:vAlign w:val="center"/>
+          </w:tcPr>
+          <w:p>
+            <w:pPr>
+              <w:bidi/>
+              <w:jc w:val="center"/>
+            </w:pPr>
+            <w:r>
+              <w:rPr>
+                <w:sz w:val="22"/>
+                <w:szCs w:val="22"/>
+                <w:rtl/>
+              </w:rPr>
+              <w:t>—</w:t>
+            </w:r>
+          </w:p>
+        </w:tc>
+        <w:tc>
+          <w:tcPr>
+            <w:tcW w:w="1828" w:type="dxa"/>
             <w:tcBorders>
               <w:top w:val="single" w:sz="4" w:space="0" w:color="000000"/>
               <w:left w:val="single" w:sz="4" w:space="0" w:color="000000"/>
@@ -7199,7 +7941,7 @@
         </w:trPr>
         <w:tc>
           <w:tcPr>
-            <w:tcW w:w="500" w:type="dxa"/>
+            <w:tcW w:w="820" w:type="dxa"/>
             <w:tcBorders>
               <w:top w:val="single" w:sz="4" w:space="0" w:color="000000"/>
               <w:left w:val="single" w:sz="4" w:space="0" w:color="000000"/>
@@ -7231,31 +7973,31 @@
         </w:tc>
         <w:tc>
           <w:tcPr>
-            <w:tcW w:w="2400" w:type="dxa"/>
-            <w:tcBorders>
-              <w:top w:val="single" w:sz="4" w:space="0" w:color="000000"/>
-              <w:left w:val="single" w:sz="4" w:space="0" w:color="000000"/>
-              <w:bottom w:val="single" w:sz="4" w:space="0" w:color="000000"/>
-              <w:right w:val="single" w:sz="4" w:space="0" w:color="000000"/>
-            </w:tcBorders>
-            <w:tcMar>
-              <w:top w:w="40" w:type="dxa"/>
-              <w:left w:w="80" w:type="dxa"/>
-              <w:bottom w:w="40" w:type="dxa"/>
-              <w:right w:w="80" w:type="dxa"/>
-            </w:tcMar>
-            <w:vAlign w:val="center"/>
-          </w:tcPr>
-          <w:p>
-            <w:pPr>
-              <w:bidi/>
-              <w:jc w:val="center"/>
-            </w:pPr>
-          </w:p>
-        </w:tc>
-        <w:tc>
-          <w:tcPr>
-            <w:tcW w:w="3600" w:type="dxa"/>
+            <w:tcW w:w="1800" w:type="dxa"/>
+            <w:tcBorders>
+              <w:top w:val="single" w:sz="4" w:space="0" w:color="000000"/>
+              <w:left w:val="single" w:sz="4" w:space="0" w:color="000000"/>
+              <w:bottom w:val="single" w:sz="4" w:space="0" w:color="000000"/>
+              <w:right w:val="single" w:sz="4" w:space="0" w:color="000000"/>
+            </w:tcBorders>
+            <w:tcMar>
+              <w:top w:w="40" w:type="dxa"/>
+              <w:left w:w="80" w:type="dxa"/>
+              <w:bottom w:w="40" w:type="dxa"/>
+              <w:right w:w="80" w:type="dxa"/>
+            </w:tcMar>
+            <w:vAlign w:val="center"/>
+          </w:tcPr>
+          <w:p>
+            <w:pPr>
+              <w:bidi/>
+              <w:jc w:val="center"/>
+            </w:pPr>
+          </w:p>
+        </w:tc>
+        <w:tc>
+          <w:tcPr>
+            <w:tcW w:w="2580" w:type="dxa"/>
             <w:tcBorders>
               <w:top w:val="single" w:sz="4" w:space="0" w:color="000000"/>
               <w:left w:val="single" w:sz="4" w:space="0" w:color="000000"/>
@@ -7287,7 +8029,39 @@
         </w:tc>
         <w:tc>
           <w:tcPr>
-            <w:tcW w:w="1788" w:type="dxa"/>
+            <w:tcW w:w="1260" w:type="dxa"/>
+            <w:tcBorders>
+              <w:top w:val="single" w:sz="4" w:space="0" w:color="000000"/>
+              <w:left w:val="single" w:sz="4" w:space="0" w:color="000000"/>
+              <w:bottom w:val="single" w:sz="4" w:space="0" w:color="000000"/>
+              <w:right w:val="single" w:sz="4" w:space="0" w:color="000000"/>
+            </w:tcBorders>
+            <w:tcMar>
+              <w:top w:w="40" w:type="dxa"/>
+              <w:left w:w="80" w:type="dxa"/>
+              <w:bottom w:w="40" w:type="dxa"/>
+              <w:right w:w="80" w:type="dxa"/>
+            </w:tcMar>
+            <w:vAlign w:val="center"/>
+          </w:tcPr>
+          <w:p>
+            <w:pPr>
+              <w:bidi/>
+              <w:jc w:val="center"/>
+            </w:pPr>
+            <w:r>
+              <w:rPr>
+                <w:sz w:val="22"/>
+                <w:szCs w:val="22"/>
+                <w:rtl/>
+              </w:rPr>
+              <w:t>—</w:t>
+            </w:r>
+          </w:p>
+        </w:tc>
+        <w:tc>
+          <w:tcPr>
+            <w:tcW w:w="1828" w:type="dxa"/>
             <w:tcBorders>
               <w:top w:val="single" w:sz="4" w:space="0" w:color="000000"/>
               <w:left w:val="single" w:sz="4" w:space="0" w:color="000000"/>
@@ -7324,7 +8098,7 @@
         </w:trPr>
         <w:tc>
           <w:tcPr>
-            <w:tcW w:w="500" w:type="dxa"/>
+            <w:tcW w:w="820" w:type="dxa"/>
             <w:tcBorders>
               <w:top w:val="single" w:sz="4" w:space="0" w:color="000000"/>
               <w:left w:val="single" w:sz="4" w:space="0" w:color="000000"/>
@@ -7356,31 +8130,31 @@
         </w:tc>
         <w:tc>
           <w:tcPr>
-            <w:tcW w:w="2400" w:type="dxa"/>
-            <w:tcBorders>
-              <w:top w:val="single" w:sz="4" w:space="0" w:color="000000"/>
-              <w:left w:val="single" w:sz="4" w:space="0" w:color="000000"/>
-              <w:bottom w:val="single" w:sz="4" w:space="0" w:color="000000"/>
-              <w:right w:val="single" w:sz="4" w:space="0" w:color="000000"/>
-            </w:tcBorders>
-            <w:tcMar>
-              <w:top w:w="40" w:type="dxa"/>
-              <w:left w:w="80" w:type="dxa"/>
-              <w:bottom w:w="40" w:type="dxa"/>
-              <w:right w:w="80" w:type="dxa"/>
-            </w:tcMar>
-            <w:vAlign w:val="center"/>
-          </w:tcPr>
-          <w:p>
-            <w:pPr>
-              <w:bidi/>
-              <w:jc w:val="center"/>
-            </w:pPr>
-          </w:p>
-        </w:tc>
-        <w:tc>
-          <w:tcPr>
-            <w:tcW w:w="3600" w:type="dxa"/>
+            <w:tcW w:w="1800" w:type="dxa"/>
+            <w:tcBorders>
+              <w:top w:val="single" w:sz="4" w:space="0" w:color="000000"/>
+              <w:left w:val="single" w:sz="4" w:space="0" w:color="000000"/>
+              <w:bottom w:val="single" w:sz="4" w:space="0" w:color="000000"/>
+              <w:right w:val="single" w:sz="4" w:space="0" w:color="000000"/>
+            </w:tcBorders>
+            <w:tcMar>
+              <w:top w:w="40" w:type="dxa"/>
+              <w:left w:w="80" w:type="dxa"/>
+              <w:bottom w:w="40" w:type="dxa"/>
+              <w:right w:w="80" w:type="dxa"/>
+            </w:tcMar>
+            <w:vAlign w:val="center"/>
+          </w:tcPr>
+          <w:p>
+            <w:pPr>
+              <w:bidi/>
+              <w:jc w:val="center"/>
+            </w:pPr>
+          </w:p>
+        </w:tc>
+        <w:tc>
+          <w:tcPr>
+            <w:tcW w:w="2580" w:type="dxa"/>
             <w:tcBorders>
               <w:top w:val="single" w:sz="4" w:space="0" w:color="000000"/>
               <w:left w:val="single" w:sz="4" w:space="0" w:color="000000"/>
@@ -7412,7 +8186,39 @@
         </w:tc>
         <w:tc>
           <w:tcPr>
-            <w:tcW w:w="1788" w:type="dxa"/>
+            <w:tcW w:w="1260" w:type="dxa"/>
+            <w:tcBorders>
+              <w:top w:val="single" w:sz="4" w:space="0" w:color="000000"/>
+              <w:left w:val="single" w:sz="4" w:space="0" w:color="000000"/>
+              <w:bottom w:val="single" w:sz="4" w:space="0" w:color="000000"/>
+              <w:right w:val="single" w:sz="4" w:space="0" w:color="000000"/>
+            </w:tcBorders>
+            <w:tcMar>
+              <w:top w:w="40" w:type="dxa"/>
+              <w:left w:w="80" w:type="dxa"/>
+              <w:bottom w:w="40" w:type="dxa"/>
+              <w:right w:w="80" w:type="dxa"/>
+            </w:tcMar>
+            <w:vAlign w:val="center"/>
+          </w:tcPr>
+          <w:p>
+            <w:pPr>
+              <w:bidi/>
+              <w:jc w:val="center"/>
+            </w:pPr>
+            <w:r>
+              <w:rPr>
+                <w:sz w:val="22"/>
+                <w:szCs w:val="22"/>
+                <w:rtl/>
+              </w:rPr>
+              <w:t>—</w:t>
+            </w:r>
+          </w:p>
+        </w:tc>
+        <w:tc>
+          <w:tcPr>
+            <w:tcW w:w="1828" w:type="dxa"/>
             <w:tcBorders>
               <w:top w:val="single" w:sz="4" w:space="0" w:color="000000"/>
               <w:left w:val="single" w:sz="4" w:space="0" w:color="000000"/>
@@ -7449,7 +8255,7 @@
         </w:trPr>
         <w:tc>
           <w:tcPr>
-            <w:tcW w:w="500" w:type="dxa"/>
+            <w:tcW w:w="820" w:type="dxa"/>
             <w:tcBorders>
               <w:top w:val="single" w:sz="4" w:space="0" w:color="000000"/>
               <w:left w:val="single" w:sz="4" w:space="0" w:color="000000"/>
@@ -7481,7 +8287,7 @@
         </w:tc>
         <w:tc>
           <w:tcPr>
-            <w:tcW w:w="2400" w:type="dxa"/>
+            <w:tcW w:w="1800" w:type="dxa"/>
             <w:tcBorders>
               <w:top w:val="single" w:sz="4" w:space="0" w:color="000000"/>
               <w:left w:val="single" w:sz="4" w:space="0" w:color="000000"/>
@@ -7513,7 +8319,7 @@
         </w:tc>
         <w:tc>
           <w:tcPr>
-            <w:tcW w:w="3600" w:type="dxa"/>
+            <w:tcW w:w="2580" w:type="dxa"/>
             <w:tcBorders>
               <w:top w:val="single" w:sz="4" w:space="0" w:color="000000"/>
               <w:left w:val="single" w:sz="4" w:space="0" w:color="000000"/>
@@ -7545,7 +8351,39 @@
         </w:tc>
         <w:tc>
           <w:tcPr>
-            <w:tcW w:w="1788" w:type="dxa"/>
+            <w:tcW w:w="1260" w:type="dxa"/>
+            <w:tcBorders>
+              <w:top w:val="single" w:sz="4" w:space="0" w:color="000000"/>
+              <w:left w:val="single" w:sz="4" w:space="0" w:color="000000"/>
+              <w:bottom w:val="single" w:sz="4" w:space="0" w:color="000000"/>
+              <w:right w:val="single" w:sz="4" w:space="0" w:color="000000"/>
+            </w:tcBorders>
+            <w:tcMar>
+              <w:top w:w="40" w:type="dxa"/>
+              <w:left w:w="80" w:type="dxa"/>
+              <w:bottom w:w="40" w:type="dxa"/>
+              <w:right w:w="80" w:type="dxa"/>
+            </w:tcMar>
+            <w:vAlign w:val="center"/>
+          </w:tcPr>
+          <w:p>
+            <w:pPr>
+              <w:bidi/>
+              <w:jc w:val="center"/>
+            </w:pPr>
+            <w:r>
+              <w:rPr>
+                <w:sz w:val="22"/>
+                <w:szCs w:val="22"/>
+                <w:rtl/>
+              </w:rPr>
+              <w:t>۴</w:t>
+            </w:r>
+          </w:p>
+        </w:tc>
+        <w:tc>
+          <w:tcPr>
+            <w:tcW w:w="1828" w:type="dxa"/>
             <w:tcBorders>
               <w:top w:val="single" w:sz="4" w:space="0" w:color="000000"/>
               <w:left w:val="single" w:sz="4" w:space="0" w:color="000000"/>
@@ -7582,7 +8420,7 @@
         </w:trPr>
         <w:tc>
           <w:tcPr>
-            <w:tcW w:w="500" w:type="dxa"/>
+            <w:tcW w:w="820" w:type="dxa"/>
             <w:tcBorders>
               <w:top w:val="single" w:sz="4" w:space="0" w:color="000000"/>
               <w:left w:val="single" w:sz="4" w:space="0" w:color="000000"/>
@@ -7614,31 +8452,31 @@
         </w:tc>
         <w:tc>
           <w:tcPr>
-            <w:tcW w:w="2400" w:type="dxa"/>
-            <w:tcBorders>
-              <w:top w:val="single" w:sz="4" w:space="0" w:color="000000"/>
-              <w:left w:val="single" w:sz="4" w:space="0" w:color="000000"/>
-              <w:bottom w:val="single" w:sz="4" w:space="0" w:color="000000"/>
-              <w:right w:val="single" w:sz="4" w:space="0" w:color="000000"/>
-            </w:tcBorders>
-            <w:tcMar>
-              <w:top w:w="40" w:type="dxa"/>
-              <w:left w:w="80" w:type="dxa"/>
-              <w:bottom w:w="40" w:type="dxa"/>
-              <w:right w:w="80" w:type="dxa"/>
-            </w:tcMar>
-            <w:vAlign w:val="center"/>
-          </w:tcPr>
-          <w:p>
-            <w:pPr>
-              <w:bidi/>
-              <w:jc w:val="center"/>
-            </w:pPr>
-          </w:p>
-        </w:tc>
-        <w:tc>
-          <w:tcPr>
-            <w:tcW w:w="3600" w:type="dxa"/>
+            <w:tcW w:w="1800" w:type="dxa"/>
+            <w:tcBorders>
+              <w:top w:val="single" w:sz="4" w:space="0" w:color="000000"/>
+              <w:left w:val="single" w:sz="4" w:space="0" w:color="000000"/>
+              <w:bottom w:val="single" w:sz="4" w:space="0" w:color="000000"/>
+              <w:right w:val="single" w:sz="4" w:space="0" w:color="000000"/>
+            </w:tcBorders>
+            <w:tcMar>
+              <w:top w:w="40" w:type="dxa"/>
+              <w:left w:w="80" w:type="dxa"/>
+              <w:bottom w:w="40" w:type="dxa"/>
+              <w:right w:w="80" w:type="dxa"/>
+            </w:tcMar>
+            <w:vAlign w:val="center"/>
+          </w:tcPr>
+          <w:p>
+            <w:pPr>
+              <w:bidi/>
+              <w:jc w:val="center"/>
+            </w:pPr>
+          </w:p>
+        </w:tc>
+        <w:tc>
+          <w:tcPr>
+            <w:tcW w:w="2580" w:type="dxa"/>
             <w:tcBorders>
               <w:top w:val="single" w:sz="4" w:space="0" w:color="000000"/>
               <w:left w:val="single" w:sz="4" w:space="0" w:color="000000"/>
@@ -7670,7 +8508,39 @@
         </w:tc>
         <w:tc>
           <w:tcPr>
-            <w:tcW w:w="1788" w:type="dxa"/>
+            <w:tcW w:w="1260" w:type="dxa"/>
+            <w:tcBorders>
+              <w:top w:val="single" w:sz="4" w:space="0" w:color="000000"/>
+              <w:left w:val="single" w:sz="4" w:space="0" w:color="000000"/>
+              <w:bottom w:val="single" w:sz="4" w:space="0" w:color="000000"/>
+              <w:right w:val="single" w:sz="4" w:space="0" w:color="000000"/>
+            </w:tcBorders>
+            <w:tcMar>
+              <w:top w:w="40" w:type="dxa"/>
+              <w:left w:w="80" w:type="dxa"/>
+              <w:bottom w:w="40" w:type="dxa"/>
+              <w:right w:w="80" w:type="dxa"/>
+            </w:tcMar>
+            <w:vAlign w:val="center"/>
+          </w:tcPr>
+          <w:p>
+            <w:pPr>
+              <w:bidi/>
+              <w:jc w:val="center"/>
+            </w:pPr>
+            <w:r>
+              <w:rPr>
+                <w:sz w:val="22"/>
+                <w:szCs w:val="22"/>
+                <w:rtl/>
+              </w:rPr>
+              <w:t>۴</w:t>
+            </w:r>
+          </w:p>
+        </w:tc>
+        <w:tc>
+          <w:tcPr>
+            <w:tcW w:w="1828" w:type="dxa"/>
             <w:tcBorders>
               <w:top w:val="single" w:sz="4" w:space="0" w:color="000000"/>
               <w:left w:val="single" w:sz="4" w:space="0" w:color="000000"/>
@@ -7707,7 +8577,7 @@
         </w:trPr>
         <w:tc>
           <w:tcPr>
-            <w:tcW w:w="500" w:type="dxa"/>
+            <w:tcW w:w="820" w:type="dxa"/>
             <w:tcBorders>
               <w:top w:val="single" w:sz="4" w:space="0" w:color="000000"/>
               <w:left w:val="single" w:sz="4" w:space="0" w:color="000000"/>
@@ -7739,31 +8609,31 @@
         </w:tc>
         <w:tc>
           <w:tcPr>
-            <w:tcW w:w="2400" w:type="dxa"/>
-            <w:tcBorders>
-              <w:top w:val="single" w:sz="4" w:space="0" w:color="000000"/>
-              <w:left w:val="single" w:sz="4" w:space="0" w:color="000000"/>
-              <w:bottom w:val="single" w:sz="4" w:space="0" w:color="000000"/>
-              <w:right w:val="single" w:sz="4" w:space="0" w:color="000000"/>
-            </w:tcBorders>
-            <w:tcMar>
-              <w:top w:w="40" w:type="dxa"/>
-              <w:left w:w="80" w:type="dxa"/>
-              <w:bottom w:w="40" w:type="dxa"/>
-              <w:right w:w="80" w:type="dxa"/>
-            </w:tcMar>
-            <w:vAlign w:val="center"/>
-          </w:tcPr>
-          <w:p>
-            <w:pPr>
-              <w:bidi/>
-              <w:jc w:val="center"/>
-            </w:pPr>
-          </w:p>
-        </w:tc>
-        <w:tc>
-          <w:tcPr>
-            <w:tcW w:w="3600" w:type="dxa"/>
+            <w:tcW w:w="1800" w:type="dxa"/>
+            <w:tcBorders>
+              <w:top w:val="single" w:sz="4" w:space="0" w:color="000000"/>
+              <w:left w:val="single" w:sz="4" w:space="0" w:color="000000"/>
+              <w:bottom w:val="single" w:sz="4" w:space="0" w:color="000000"/>
+              <w:right w:val="single" w:sz="4" w:space="0" w:color="000000"/>
+            </w:tcBorders>
+            <w:tcMar>
+              <w:top w:w="40" w:type="dxa"/>
+              <w:left w:w="80" w:type="dxa"/>
+              <w:bottom w:w="40" w:type="dxa"/>
+              <w:right w:w="80" w:type="dxa"/>
+            </w:tcMar>
+            <w:vAlign w:val="center"/>
+          </w:tcPr>
+          <w:p>
+            <w:pPr>
+              <w:bidi/>
+              <w:jc w:val="center"/>
+            </w:pPr>
+          </w:p>
+        </w:tc>
+        <w:tc>
+          <w:tcPr>
+            <w:tcW w:w="2580" w:type="dxa"/>
             <w:tcBorders>
               <w:top w:val="single" w:sz="4" w:space="0" w:color="000000"/>
               <w:left w:val="single" w:sz="4" w:space="0" w:color="000000"/>
@@ -7795,7 +8665,39 @@
         </w:tc>
         <w:tc>
           <w:tcPr>
-            <w:tcW w:w="1788" w:type="dxa"/>
+            <w:tcW w:w="1260" w:type="dxa"/>
+            <w:tcBorders>
+              <w:top w:val="single" w:sz="4" w:space="0" w:color="000000"/>
+              <w:left w:val="single" w:sz="4" w:space="0" w:color="000000"/>
+              <w:bottom w:val="single" w:sz="4" w:space="0" w:color="000000"/>
+              <w:right w:val="single" w:sz="4" w:space="0" w:color="000000"/>
+            </w:tcBorders>
+            <w:tcMar>
+              <w:top w:w="40" w:type="dxa"/>
+              <w:left w:w="80" w:type="dxa"/>
+              <w:bottom w:w="40" w:type="dxa"/>
+              <w:right w:w="80" w:type="dxa"/>
+            </w:tcMar>
+            <w:vAlign w:val="center"/>
+          </w:tcPr>
+          <w:p>
+            <w:pPr>
+              <w:bidi/>
+              <w:jc w:val="center"/>
+            </w:pPr>
+            <w:r>
+              <w:rPr>
+                <w:sz w:val="22"/>
+                <w:szCs w:val="22"/>
+                <w:rtl/>
+              </w:rPr>
+              <w:t>۴</w:t>
+            </w:r>
+          </w:p>
+        </w:tc>
+        <w:tc>
+          <w:tcPr>
+            <w:tcW w:w="1828" w:type="dxa"/>
             <w:tcBorders>
               <w:top w:val="single" w:sz="4" w:space="0" w:color="000000"/>
               <w:left w:val="single" w:sz="4" w:space="0" w:color="000000"/>
@@ -7832,7 +8734,7 @@
         </w:trPr>
         <w:tc>
           <w:tcPr>
-            <w:tcW w:w="500" w:type="dxa"/>
+            <w:tcW w:w="820" w:type="dxa"/>
             <w:tcBorders>
               <w:top w:val="single" w:sz="4" w:space="0" w:color="000000"/>
               <w:left w:val="single" w:sz="4" w:space="0" w:color="000000"/>
@@ -7864,7 +8766,7 @@
         </w:tc>
         <w:tc>
           <w:tcPr>
-            <w:tcW w:w="2400" w:type="dxa"/>
+            <w:tcW w:w="1800" w:type="dxa"/>
             <w:tcBorders>
               <w:top w:val="single" w:sz="4" w:space="0" w:color="000000"/>
               <w:left w:val="single" w:sz="4" w:space="0" w:color="000000"/>
@@ -7896,7 +8798,7 @@
         </w:tc>
         <w:tc>
           <w:tcPr>
-            <w:tcW w:w="3600" w:type="dxa"/>
+            <w:tcW w:w="2580" w:type="dxa"/>
             <w:tcBorders>
               <w:top w:val="single" w:sz="4" w:space="0" w:color="000000"/>
               <w:left w:val="single" w:sz="4" w:space="0" w:color="000000"/>
@@ -7928,7 +8830,39 @@
         </w:tc>
         <w:tc>
           <w:tcPr>
-            <w:tcW w:w="1788" w:type="dxa"/>
+            <w:tcW w:w="1260" w:type="dxa"/>
+            <w:tcBorders>
+              <w:top w:val="single" w:sz="4" w:space="0" w:color="000000"/>
+              <w:left w:val="single" w:sz="4" w:space="0" w:color="000000"/>
+              <w:bottom w:val="single" w:sz="4" w:space="0" w:color="000000"/>
+              <w:right w:val="single" w:sz="4" w:space="0" w:color="000000"/>
+            </w:tcBorders>
+            <w:tcMar>
+              <w:top w:w="40" w:type="dxa"/>
+              <w:left w:w="80" w:type="dxa"/>
+              <w:bottom w:w="40" w:type="dxa"/>
+              <w:right w:w="80" w:type="dxa"/>
+            </w:tcMar>
+            <w:vAlign w:val="center"/>
+          </w:tcPr>
+          <w:p>
+            <w:pPr>
+              <w:bidi/>
+              <w:jc w:val="center"/>
+            </w:pPr>
+            <w:r>
+              <w:rPr>
+                <w:sz w:val="22"/>
+                <w:szCs w:val="22"/>
+                <w:rtl/>
+              </w:rPr>
+              <w:t>—</w:t>
+            </w:r>
+          </w:p>
+        </w:tc>
+        <w:tc>
+          <w:tcPr>
+            <w:tcW w:w="1828" w:type="dxa"/>
             <w:tcBorders>
               <w:top w:val="single" w:sz="4" w:space="0" w:color="000000"/>
               <w:left w:val="single" w:sz="4" w:space="0" w:color="000000"/>
@@ -7965,7 +8899,7 @@
         </w:trPr>
         <w:tc>
           <w:tcPr>
-            <w:tcW w:w="500" w:type="dxa"/>
+            <w:tcW w:w="820" w:type="dxa"/>
             <w:tcBorders>
               <w:top w:val="single" w:sz="4" w:space="0" w:color="000000"/>
               <w:left w:val="single" w:sz="4" w:space="0" w:color="000000"/>
@@ -7997,31 +8931,31 @@
         </w:tc>
         <w:tc>
           <w:tcPr>
-            <w:tcW w:w="2400" w:type="dxa"/>
-            <w:tcBorders>
-              <w:top w:val="single" w:sz="4" w:space="0" w:color="000000"/>
-              <w:left w:val="single" w:sz="4" w:space="0" w:color="000000"/>
-              <w:bottom w:val="single" w:sz="4" w:space="0" w:color="000000"/>
-              <w:right w:val="single" w:sz="4" w:space="0" w:color="000000"/>
-            </w:tcBorders>
-            <w:tcMar>
-              <w:top w:w="40" w:type="dxa"/>
-              <w:left w:w="80" w:type="dxa"/>
-              <w:bottom w:w="40" w:type="dxa"/>
-              <w:right w:w="80" w:type="dxa"/>
-            </w:tcMar>
-            <w:vAlign w:val="center"/>
-          </w:tcPr>
-          <w:p>
-            <w:pPr>
-              <w:bidi/>
-              <w:jc w:val="center"/>
-            </w:pPr>
-          </w:p>
-        </w:tc>
-        <w:tc>
-          <w:tcPr>
-            <w:tcW w:w="3600" w:type="dxa"/>
+            <w:tcW w:w="1800" w:type="dxa"/>
+            <w:tcBorders>
+              <w:top w:val="single" w:sz="4" w:space="0" w:color="000000"/>
+              <w:left w:val="single" w:sz="4" w:space="0" w:color="000000"/>
+              <w:bottom w:val="single" w:sz="4" w:space="0" w:color="000000"/>
+              <w:right w:val="single" w:sz="4" w:space="0" w:color="000000"/>
+            </w:tcBorders>
+            <w:tcMar>
+              <w:top w:w="40" w:type="dxa"/>
+              <w:left w:w="80" w:type="dxa"/>
+              <w:bottom w:w="40" w:type="dxa"/>
+              <w:right w:w="80" w:type="dxa"/>
+            </w:tcMar>
+            <w:vAlign w:val="center"/>
+          </w:tcPr>
+          <w:p>
+            <w:pPr>
+              <w:bidi/>
+              <w:jc w:val="center"/>
+            </w:pPr>
+          </w:p>
+        </w:tc>
+        <w:tc>
+          <w:tcPr>
+            <w:tcW w:w="2580" w:type="dxa"/>
             <w:tcBorders>
               <w:top w:val="single" w:sz="4" w:space="0" w:color="000000"/>
               <w:left w:val="single" w:sz="4" w:space="0" w:color="000000"/>
@@ -8053,7 +8987,39 @@
         </w:tc>
         <w:tc>
           <w:tcPr>
-            <w:tcW w:w="1788" w:type="dxa"/>
+            <w:tcW w:w="1260" w:type="dxa"/>
+            <w:tcBorders>
+              <w:top w:val="single" w:sz="4" w:space="0" w:color="000000"/>
+              <w:left w:val="single" w:sz="4" w:space="0" w:color="000000"/>
+              <w:bottom w:val="single" w:sz="4" w:space="0" w:color="000000"/>
+              <w:right w:val="single" w:sz="4" w:space="0" w:color="000000"/>
+            </w:tcBorders>
+            <w:tcMar>
+              <w:top w:w="40" w:type="dxa"/>
+              <w:left w:w="80" w:type="dxa"/>
+              <w:bottom w:w="40" w:type="dxa"/>
+              <w:right w:w="80" w:type="dxa"/>
+            </w:tcMar>
+            <w:vAlign w:val="center"/>
+          </w:tcPr>
+          <w:p>
+            <w:pPr>
+              <w:bidi/>
+              <w:jc w:val="center"/>
+            </w:pPr>
+            <w:r>
+              <w:rPr>
+                <w:sz w:val="22"/>
+                <w:szCs w:val="22"/>
+                <w:rtl/>
+              </w:rPr>
+              <w:t>—</w:t>
+            </w:r>
+          </w:p>
+        </w:tc>
+        <w:tc>
+          <w:tcPr>
+            <w:tcW w:w="1828" w:type="dxa"/>
             <w:tcBorders>
               <w:top w:val="single" w:sz="4" w:space="0" w:color="000000"/>
               <w:left w:val="single" w:sz="4" w:space="0" w:color="000000"/>

</xml_diff>